<commit_message>
Task 7: 迁移附件与 5.1 repeat 动态块
</commit_message>
<xml_diff>
--- a/templates/efficacy-report-template.docx
+++ b/templates/efficacy-report-template.docx
@@ -19432,6 +19432,7 @@
           </ns2:textFill>
         </w:rPr>
       </w:pPr>
+      <w:bookmarkStart w:id="500" w:name="tpl_key_issue_items"/>
       <w:r>
         <w:rPr>
           <w:rFonts w:hint="eastAsia" w:ascii="汉仪中宋简" w:hAnsi="汉仪中宋简" w:eastAsia="汉仪中宋简" w:cs="汉仪中宋简"/>
@@ -19448,10 +19449,10 @@
             </ns2:solidFill>
           </ns2:textFill>
         </w:rPr>
-        <w:t>药品疗效与经济性是影响高血压患者长期治疗依从性和疾病控制效果的核心维度，两者并非孤立存在，而是存在显著的协同关联。结合本次调研核心数据，对两个维度开展交叉联合分析，结果如下：</w:t>
+        <w:t xml:space="preserve">{{repeat.key_issue_items}}</w:t>
       </w:r>
     </w:p>
-    <w:p ns2:paraId="02310A52">
+    <w:p ns2:paraId="435FF72E">
       <w:pPr>
         <w:keepNext w:val="0"/>
         <w:keepLines w:val="0"/>
@@ -19506,124 +19507,9 @@
             </ns2:solidFill>
           </ns2:textFill>
         </w:rPr>
-        <w:t>从数据交叉关联来看，在血压控制达标（即选择A“血压稳定在正常范围”+B“血压多数时间在正常范围”）的1542名患者中，96.82%（1493/1542）的患者同时认可药品价格合理性（选择C“在可接受范围”+D“无压力”），仅有3.18%（49/1542）的患者认为价格勉强承受；而在血压偶尔波动）的100名患者中，虽有92%（92/100）的患者认可价格合理性，但价格勉强承受的比例为8%（8/100），显著高于血压控制达标群体。这一数据差异清晰揭示了疗效与经济性的正向协同关系。</w:t>
+        <w:t>药品疗效与经济性是影响高血压患者长期治疗依从性和疾病控制效果的核心维度，两者并非孤立存在，而是存在显著的协同关联。结合本次调研核心数据，对两个维度开展交叉联合分析，结果如下：</w:t>
       </w:r>
-    </w:p>
-    <w:p ns2:paraId="100136A4">
-      <w:pPr>
-        <w:keepNext w:val="0"/>
-        <w:keepLines w:val="0"/>
-        <w:pageBreakBefore w:val="0"/>
-        <w:widowControl w:val="0"/>
-        <w:numPr>
-          <w:ilvl w:val="0"/>
-          <w:numId w:val="0"/>
-        </w:numPr>
-        <w:kinsoku/>
-        <w:wordWrap/>
-        <w:overflowPunct/>
-        <w:topLinePunct w:val="0"/>
-        <w:autoSpaceDE/>
-        <w:autoSpaceDN/>
-        <w:bidi w:val="0"/>
-        <w:adjustRightInd/>
-        <w:snapToGrid/>
-        <w:spacing w:line="600" w:lineRule="auto"/>
-        <w:ind w:left="0" w:leftChars="0" w:firstLine="480" w:firstLineChars="200"/>
-        <w:jc w:val="left"/>
-        <w:textAlignment w:val="auto"/>
-        <w:rPr>
-          <w:rFonts w:hint="eastAsia" w:ascii="汉仪中宋简" w:hAnsi="汉仪中宋简" w:eastAsia="汉仪中宋简" w:cs="汉仪中宋简"/>
-          <w:b w:val="0"/>
-          <w:bCs w:val="0"/>
-          <w:color w:val="000000" w:themeColor="text1"/>
-          <w:sz w:val="24"/>
-          <w:szCs w:val="24"/>
-          <w:highlight w:val="none"/>
-          <w:lang w:val="en-US" w:eastAsia="zh-CN"/>
-          <ns2:textFill>
-            <ns2:solidFill>
-              <ns2:schemeClr ns2:val="tx1"/>
-            </ns2:solidFill>
-          </ns2:textFill>
-        </w:rPr>
-      </w:pPr>
-      <w:r>
-        <w:rPr>
-          <w:rFonts w:hint="eastAsia" w:ascii="汉仪中宋简" w:hAnsi="汉仪中宋简" w:eastAsia="汉仪中宋简" w:cs="汉仪中宋简"/>
-          <w:b w:val="0"/>
-          <w:bCs w:val="0"/>
-          <w:color w:val="000000" w:themeColor="text1"/>
-          <w:sz w:val="24"/>
-          <w:szCs w:val="24"/>
-          <w:highlight w:val="none"/>
-          <w:lang w:val="en-US" w:eastAsia="zh-CN"/>
-          <ns2:textFill>
-            <ns2:solidFill>
-              <ns2:schemeClr ns2:val="tx1"/>
-            </ns2:solidFill>
-          </ns2:textFill>
-        </w:rPr>
-        <w:t>从临床治疗逻辑来看，这种协同关系形成了“经济可及-规律用药-疗效稳固”的良性循环：一方面，该药物96.59%的高价格接受度，大幅降低了患者长期购药的经济压力，使其能够持续规律服药，避免因经济负担中断治疗，为药物疗效的充分发挥提供了前提保障；另一方面，93.91%的高血压控制达标率，让患者切实感知到药物的治疗价值，进一步强化了对“价格-治疗价值”匹配度的认可，反向提升了其长期用药的意愿。反之，血压偶尔波动群体中更高的价格勉强承受比例也提示，经济压力可能是影响该部分患者用药连续性的潜在因素，进而间接影响血压控制效果。</w:t>
-      </w:r>
-    </w:p>
-    <w:p ns2:paraId="7E5CDE53">
-      <w:pPr>
-        <w:keepNext w:val="0"/>
-        <w:keepLines w:val="0"/>
-        <w:pageBreakBefore w:val="0"/>
-        <w:widowControl w:val="0"/>
-        <w:numPr>
-          <w:ilvl w:val="0"/>
-          <w:numId w:val="0"/>
-        </w:numPr>
-        <w:kinsoku/>
-        <w:wordWrap/>
-        <w:overflowPunct/>
-        <w:topLinePunct w:val="0"/>
-        <w:autoSpaceDE/>
-        <w:autoSpaceDN/>
-        <w:bidi w:val="0"/>
-        <w:adjustRightInd/>
-        <w:snapToGrid/>
-        <w:spacing w:line="600" w:lineRule="auto"/>
-        <w:ind w:left="0" w:leftChars="0" w:firstLine="480" w:firstLineChars="200"/>
-        <w:jc w:val="left"/>
-        <w:textAlignment w:val="auto"/>
-        <w:rPr>
-          <w:rFonts w:hint="eastAsia" w:ascii="汉仪中宋简" w:hAnsi="汉仪中宋简" w:eastAsia="汉仪中宋简" w:cs="汉仪中宋简"/>
-          <w:b w:val="0"/>
-          <w:bCs w:val="0"/>
-          <w:color w:val="000000" w:themeColor="text1"/>
-          <w:sz w:val="24"/>
-          <w:szCs w:val="24"/>
-          <w:highlight w:val="none"/>
-          <w:lang w:val="en-US" w:eastAsia="zh-CN"/>
-          <ns2:textFill>
-            <ns2:solidFill>
-              <ns2:schemeClr ns2:val="tx1"/>
-            </ns2:solidFill>
-          </ns2:textFill>
-        </w:rPr>
-      </w:pPr>
-      <w:r>
-        <w:rPr>
-          <w:rFonts w:hint="eastAsia" w:ascii="汉仪中宋简" w:hAnsi="汉仪中宋简" w:eastAsia="汉仪中宋简" w:cs="汉仪中宋简"/>
-          <w:b w:val="0"/>
-          <w:bCs w:val="0"/>
-          <w:color w:val="000000" w:themeColor="text1"/>
-          <w:sz w:val="24"/>
-          <w:szCs w:val="24"/>
-          <w:highlight w:val="none"/>
-          <w:lang w:val="en-US" w:eastAsia="zh-CN"/>
-          <ns2:textFill>
-            <ns2:solidFill>
-              <ns2:schemeClr ns2:val="tx1"/>
-            </ns2:solidFill>
-          </ns2:textFill>
-        </w:rPr>
-        <w:t>此外，无患者反馈血压持续失控，也无患者反馈价格难以承受，这一“双零”结果进一步印证了该药物在疗效可靠性与价格亲民性上的均衡优势，能够同时满足患者“能降压”的核心治疗需求和“用得起”的经济需求，为高血压长期规范管理提供了双重核心支撑。</w:t>
-      </w:r>
+      <w:bookmarkEnd w:id="500"/>
     </w:p>
     <w:p ns2:paraId="472857A5">
       <w:pPr>
@@ -19860,6 +19746,51 @@
           <w:lang w:val="en-US" w:eastAsia="zh-CN"/>
         </w:rPr>
       </w:pPr>
+      <w:bookmarkStart w:id="501" w:name="tpl_attachment_questions"/>
+      <w:r>
+        <w:rPr>
+          <w:rFonts w:hint="default" w:ascii="汉仪中宋简" w:hAnsi="汉仪中宋简" w:eastAsia="汉仪中宋简" w:cs="汉仪中宋简"/>
+          <w:snapToGrid/>
+          <w:kern w:val="2"/>
+          <w:sz w:val="24"/>
+          <w:szCs w:val="24"/>
+          <w:lang w:val="en-US" w:eastAsia="zh-CN"/>
+        </w:rPr>
+        <w:t xml:space="preserve">{{repeat.attachment_questions}}</w:t>
+      </w:r>
+    </w:p>
+    <w:p ns2:paraId="6CCA3D18">
+      <w:pPr>
+        <w:keepNext w:val="0"/>
+        <w:keepLines w:val="0"/>
+        <w:pageBreakBefore w:val="0"/>
+        <w:widowControl w:val="0"/>
+        <w:numPr>
+          <w:ilvl w:val="0"/>
+          <w:numId w:val="9"/>
+        </w:numPr>
+        <w:kinsoku/>
+        <w:wordWrap/>
+        <w:overflowPunct/>
+        <w:topLinePunct w:val="0"/>
+        <w:autoSpaceDE/>
+        <w:autoSpaceDN/>
+        <w:bidi w:val="0"/>
+        <w:adjustRightInd/>
+        <w:snapToGrid/>
+        <w:spacing w:line="480" w:lineRule="auto"/>
+        <w:ind w:left="425" w:leftChars="0" w:hanging="425" w:firstLineChars="0"/>
+        <w:jc w:val="left"/>
+        <w:textAlignment w:val="auto"/>
+        <w:rPr>
+          <w:rFonts w:hint="default" w:ascii="汉仪中宋简" w:hAnsi="汉仪中宋简" w:eastAsia="汉仪中宋简" w:cs="汉仪中宋简"/>
+          <w:snapToGrid/>
+          <w:kern w:val="2"/>
+          <w:sz w:val="24"/>
+          <w:szCs w:val="24"/>
+          <w:lang w:val="en-US" w:eastAsia="zh-CN"/>
+        </w:rPr>
+      </w:pPr>
       <w:r>
         <w:rPr>
           <w:rFonts w:hint="default" w:ascii="汉仪中宋简" w:hAnsi="汉仪中宋简" w:eastAsia="汉仪中宋简" w:cs="汉仪中宋简"/>
@@ -19926,3559 +19857,7 @@
         </w:rPr>
         <w:t>血压稳定在正常范围</w:t>
       </w:r>
-    </w:p>
-    <w:p ns2:paraId="6CE1425B">
-      <w:pPr>
-        <w:keepNext w:val="0"/>
-        <w:keepLines w:val="0"/>
-        <w:pageBreakBefore w:val="0"/>
-        <w:widowControl w:val="0"/>
-        <w:numPr>
-          <w:ilvl w:val="0"/>
-          <w:numId w:val="0"/>
-        </w:numPr>
-        <w:kinsoku/>
-        <w:wordWrap/>
-        <w:overflowPunct/>
-        <w:topLinePunct w:val="0"/>
-        <w:autoSpaceDE/>
-        <w:autoSpaceDN/>
-        <w:bidi w:val="0"/>
-        <w:adjustRightInd/>
-        <w:snapToGrid/>
-        <w:spacing w:line="480" w:lineRule="auto"/>
-        <w:ind w:left="0" w:leftChars="0" w:firstLine="218" w:firstLineChars="91"/>
-        <w:jc w:val="left"/>
-        <w:textAlignment w:val="auto"/>
-        <w:rPr>
-          <w:rFonts w:hint="default" w:ascii="汉仪中宋简" w:hAnsi="汉仪中宋简" w:eastAsia="汉仪中宋简" w:cs="汉仪中宋简"/>
-          <w:snapToGrid/>
-          <w:kern w:val="2"/>
-          <w:sz w:val="24"/>
-          <w:szCs w:val="24"/>
-          <w:lang w:val="en-US" w:eastAsia="zh-CN"/>
-        </w:rPr>
-      </w:pPr>
-      <w:r>
-        <w:rPr>
-          <w:rFonts w:hint="eastAsia" w:ascii="汉仪中宋简" w:hAnsi="汉仪中宋简" w:eastAsia="汉仪中宋简" w:cs="汉仪中宋简"/>
-          <w:snapToGrid/>
-          <w:kern w:val="2"/>
-          <w:sz w:val="24"/>
-          <w:szCs w:val="24"/>
-          <w:lang w:val="en-US" w:eastAsia="zh-CN"/>
-        </w:rPr>
-        <w:t xml:space="preserve">B. </w:t>
-      </w:r>
-      <w:r>
-        <w:rPr>
-          <w:rFonts w:hint="default" w:ascii="汉仪中宋简" w:hAnsi="汉仪中宋简" w:eastAsia="汉仪中宋简" w:cs="汉仪中宋简"/>
-          <w:snapToGrid/>
-          <w:kern w:val="2"/>
-          <w:sz w:val="24"/>
-          <w:szCs w:val="24"/>
-          <w:lang w:val="en-US" w:eastAsia="zh-CN"/>
-        </w:rPr>
-        <w:t>血压多数时间在正常范围</w:t>
-      </w:r>
-    </w:p>
-    <w:p ns2:paraId="4B4D6147">
-      <w:pPr>
-        <w:keepNext w:val="0"/>
-        <w:keepLines w:val="0"/>
-        <w:pageBreakBefore w:val="0"/>
-        <w:widowControl w:val="0"/>
-        <w:numPr>
-          <w:ilvl w:val="0"/>
-          <w:numId w:val="0"/>
-        </w:numPr>
-        <w:kinsoku/>
-        <w:wordWrap/>
-        <w:overflowPunct/>
-        <w:topLinePunct w:val="0"/>
-        <w:autoSpaceDE/>
-        <w:autoSpaceDN/>
-        <w:bidi w:val="0"/>
-        <w:adjustRightInd/>
-        <w:snapToGrid/>
-        <w:spacing w:line="480" w:lineRule="auto"/>
-        <w:ind w:left="0" w:leftChars="0" w:firstLine="218" w:firstLineChars="91"/>
-        <w:jc w:val="left"/>
-        <w:textAlignment w:val="auto"/>
-        <w:rPr>
-          <w:rFonts w:hint="default" w:ascii="汉仪中宋简" w:hAnsi="汉仪中宋简" w:eastAsia="汉仪中宋简" w:cs="汉仪中宋简"/>
-          <w:snapToGrid/>
-          <w:kern w:val="2"/>
-          <w:sz w:val="24"/>
-          <w:szCs w:val="24"/>
-          <w:lang w:val="en-US" w:eastAsia="zh-CN"/>
-        </w:rPr>
-      </w:pPr>
-      <w:r>
-        <w:rPr>
-          <w:rFonts w:hint="eastAsia" w:ascii="汉仪中宋简" w:hAnsi="汉仪中宋简" w:eastAsia="汉仪中宋简" w:cs="汉仪中宋简"/>
-          <w:snapToGrid/>
-          <w:kern w:val="2"/>
-          <w:sz w:val="24"/>
-          <w:szCs w:val="24"/>
-          <w:lang w:val="en-US" w:eastAsia="zh-CN"/>
-        </w:rPr>
-        <w:t xml:space="preserve">C. </w:t>
-      </w:r>
-      <w:r>
-        <w:rPr>
-          <w:rFonts w:hint="default" w:ascii="汉仪中宋简" w:hAnsi="汉仪中宋简" w:eastAsia="汉仪中宋简" w:cs="汉仪中宋简"/>
-          <w:snapToGrid/>
-          <w:kern w:val="2"/>
-          <w:sz w:val="24"/>
-          <w:szCs w:val="24"/>
-          <w:lang w:val="en-US" w:eastAsia="zh-CN"/>
-        </w:rPr>
-        <w:t>血压偶尔超出正常范围</w:t>
-      </w:r>
-    </w:p>
-    <w:p ns2:paraId="2B1D7314">
-      <w:pPr>
-        <w:keepNext w:val="0"/>
-        <w:keepLines w:val="0"/>
-        <w:pageBreakBefore w:val="0"/>
-        <w:widowControl w:val="0"/>
-        <w:numPr>
-          <w:ilvl w:val="0"/>
-          <w:numId w:val="0"/>
-        </w:numPr>
-        <w:kinsoku/>
-        <w:wordWrap/>
-        <w:overflowPunct/>
-        <w:topLinePunct w:val="0"/>
-        <w:autoSpaceDE/>
-        <w:autoSpaceDN/>
-        <w:bidi w:val="0"/>
-        <w:adjustRightInd/>
-        <w:snapToGrid/>
-        <w:spacing w:line="480" w:lineRule="auto"/>
-        <w:ind w:left="0" w:leftChars="0" w:firstLine="218" w:firstLineChars="91"/>
-        <w:jc w:val="left"/>
-        <w:textAlignment w:val="auto"/>
-        <w:rPr>
-          <w:rFonts w:hint="default" w:ascii="汉仪中宋简" w:hAnsi="汉仪中宋简" w:eastAsia="汉仪中宋简" w:cs="汉仪中宋简"/>
-          <w:snapToGrid/>
-          <w:kern w:val="2"/>
-          <w:sz w:val="24"/>
-          <w:szCs w:val="24"/>
-          <w:lang w:val="en-US" w:eastAsia="zh-CN"/>
-        </w:rPr>
-      </w:pPr>
-      <w:r>
-        <w:rPr>
-          <w:rFonts w:hint="eastAsia" w:ascii="汉仪中宋简" w:hAnsi="汉仪中宋简" w:eastAsia="汉仪中宋简" w:cs="汉仪中宋简"/>
-          <w:snapToGrid/>
-          <w:kern w:val="2"/>
-          <w:sz w:val="24"/>
-          <w:szCs w:val="24"/>
-          <w:lang w:val="en-US" w:eastAsia="zh-CN"/>
-        </w:rPr>
-        <w:t xml:space="preserve">D. </w:t>
-      </w:r>
-      <w:r>
-        <w:rPr>
-          <w:rFonts w:hint="default" w:ascii="汉仪中宋简" w:hAnsi="汉仪中宋简" w:eastAsia="汉仪中宋简" w:cs="汉仪中宋简"/>
-          <w:snapToGrid/>
-          <w:kern w:val="2"/>
-          <w:sz w:val="24"/>
-          <w:szCs w:val="24"/>
-          <w:lang w:val="en-US" w:eastAsia="zh-CN"/>
-        </w:rPr>
-        <w:t>血压持续超出正常范围</w:t>
-      </w:r>
-    </w:p>
-    <w:p ns2:paraId="352AD0F7">
-      <w:pPr>
-        <w:keepNext w:val="0"/>
-        <w:keepLines w:val="0"/>
-        <w:pageBreakBefore w:val="0"/>
-        <w:widowControl w:val="0"/>
-        <w:numPr>
-          <w:ilvl w:val="0"/>
-          <w:numId w:val="9"/>
-        </w:numPr>
-        <w:kinsoku/>
-        <w:wordWrap/>
-        <w:overflowPunct/>
-        <w:topLinePunct w:val="0"/>
-        <w:autoSpaceDE/>
-        <w:autoSpaceDN/>
-        <w:bidi w:val="0"/>
-        <w:adjustRightInd/>
-        <w:snapToGrid/>
-        <w:spacing w:line="480" w:lineRule="auto"/>
-        <w:ind w:left="425" w:leftChars="0" w:hanging="425" w:firstLineChars="0"/>
-        <w:jc w:val="left"/>
-        <w:textAlignment w:val="auto"/>
-        <w:rPr>
-          <w:rFonts w:hint="default" w:ascii="汉仪中宋简" w:hAnsi="汉仪中宋简" w:eastAsia="汉仪中宋简" w:cs="汉仪中宋简"/>
-          <w:snapToGrid/>
-          <w:kern w:val="2"/>
-          <w:sz w:val="24"/>
-          <w:szCs w:val="24"/>
-          <w:lang w:val="en-US" w:eastAsia="zh-CN"/>
-        </w:rPr>
-      </w:pPr>
-      <w:r>
-        <w:rPr>
-          <w:rFonts w:hint="default" w:ascii="汉仪中宋简" w:hAnsi="汉仪中宋简" w:eastAsia="汉仪中宋简" w:cs="汉仪中宋简"/>
-          <w:snapToGrid/>
-          <w:kern w:val="2"/>
-          <w:sz w:val="24"/>
-          <w:szCs w:val="24"/>
-          <w:lang w:val="en-US" w:eastAsia="zh-CN"/>
-        </w:rPr>
-        <w:t>您服用厄贝沙坦氢氯噻嗪片期间，是否出现过头晕、头痛症状？</w:t>
-      </w:r>
-    </w:p>
-    <w:p ns2:paraId="5AB3DCC9">
-      <w:pPr>
-        <w:keepNext w:val="0"/>
-        <w:keepLines w:val="0"/>
-        <w:pageBreakBefore w:val="0"/>
-        <w:widowControl w:val="0"/>
-        <w:numPr>
-          <w:ilvl w:val="0"/>
-          <w:numId w:val="0"/>
-        </w:numPr>
-        <w:kinsoku/>
-        <w:wordWrap/>
-        <w:overflowPunct/>
-        <w:topLinePunct w:val="0"/>
-        <w:autoSpaceDE/>
-        <w:autoSpaceDN/>
-        <w:bidi w:val="0"/>
-        <w:adjustRightInd/>
-        <w:snapToGrid/>
-        <w:spacing w:line="480" w:lineRule="auto"/>
-        <w:ind w:left="0" w:leftChars="0" w:firstLine="218" w:firstLineChars="91"/>
-        <w:jc w:val="left"/>
-        <w:textAlignment w:val="auto"/>
-        <w:rPr>
-          <w:rFonts w:hint="default" w:ascii="汉仪中宋简" w:hAnsi="汉仪中宋简" w:eastAsia="汉仪中宋简" w:cs="汉仪中宋简"/>
-          <w:snapToGrid/>
-          <w:kern w:val="2"/>
-          <w:sz w:val="24"/>
-          <w:szCs w:val="24"/>
-          <w:lang w:val="en-US" w:eastAsia="zh-CN"/>
-        </w:rPr>
-      </w:pPr>
-      <w:r>
-        <w:rPr>
-          <w:rFonts w:hint="eastAsia" w:ascii="汉仪中宋简" w:hAnsi="汉仪中宋简" w:eastAsia="汉仪中宋简" w:cs="汉仪中宋简"/>
-          <w:snapToGrid/>
-          <w:kern w:val="2"/>
-          <w:sz w:val="24"/>
-          <w:szCs w:val="24"/>
-          <w:lang w:val="en-US" w:eastAsia="zh-CN"/>
-        </w:rPr>
-        <w:t xml:space="preserve">A. </w:t>
-      </w:r>
-      <w:r>
-        <w:rPr>
-          <w:rFonts w:hint="default" w:ascii="汉仪中宋简" w:hAnsi="汉仪中宋简" w:eastAsia="汉仪中宋简" w:cs="汉仪中宋简"/>
-          <w:snapToGrid/>
-          <w:kern w:val="2"/>
-          <w:sz w:val="24"/>
-          <w:szCs w:val="24"/>
-          <w:lang w:val="en-US" w:eastAsia="zh-CN"/>
-        </w:rPr>
-        <w:t>经常出现，症状严重</w:t>
-      </w:r>
-    </w:p>
-    <w:p ns2:paraId="0DDB611B">
-      <w:pPr>
-        <w:keepNext w:val="0"/>
-        <w:keepLines w:val="0"/>
-        <w:pageBreakBefore w:val="0"/>
-        <w:widowControl w:val="0"/>
-        <w:numPr>
-          <w:ilvl w:val="0"/>
-          <w:numId w:val="0"/>
-        </w:numPr>
-        <w:kinsoku/>
-        <w:wordWrap/>
-        <w:overflowPunct/>
-        <w:topLinePunct w:val="0"/>
-        <w:autoSpaceDE/>
-        <w:autoSpaceDN/>
-        <w:bidi w:val="0"/>
-        <w:adjustRightInd/>
-        <w:snapToGrid/>
-        <w:spacing w:line="480" w:lineRule="auto"/>
-        <w:ind w:left="0" w:leftChars="0" w:firstLine="218" w:firstLineChars="91"/>
-        <w:jc w:val="left"/>
-        <w:textAlignment w:val="auto"/>
-        <w:rPr>
-          <w:rFonts w:hint="default" w:ascii="汉仪中宋简" w:hAnsi="汉仪中宋简" w:eastAsia="汉仪中宋简" w:cs="汉仪中宋简"/>
-          <w:snapToGrid/>
-          <w:kern w:val="2"/>
-          <w:sz w:val="24"/>
-          <w:szCs w:val="24"/>
-          <w:lang w:val="en-US" w:eastAsia="zh-CN"/>
-        </w:rPr>
-      </w:pPr>
-      <w:r>
-        <w:rPr>
-          <w:rFonts w:hint="eastAsia" w:ascii="汉仪中宋简" w:hAnsi="汉仪中宋简" w:eastAsia="汉仪中宋简" w:cs="汉仪中宋简"/>
-          <w:snapToGrid/>
-          <w:kern w:val="2"/>
-          <w:sz w:val="24"/>
-          <w:szCs w:val="24"/>
-          <w:lang w:val="en-US" w:eastAsia="zh-CN"/>
-        </w:rPr>
-        <w:t xml:space="preserve">B. </w:t>
-      </w:r>
-      <w:r>
-        <w:rPr>
-          <w:rFonts w:hint="default" w:ascii="汉仪中宋简" w:hAnsi="汉仪中宋简" w:eastAsia="汉仪中宋简" w:cs="汉仪中宋简"/>
-          <w:snapToGrid/>
-          <w:kern w:val="2"/>
-          <w:sz w:val="24"/>
-          <w:szCs w:val="24"/>
-          <w:lang w:val="en-US" w:eastAsia="zh-CN"/>
-        </w:rPr>
-        <w:t>偶尔出现，症状轻微可忍受</w:t>
-      </w:r>
-    </w:p>
-    <w:p ns2:paraId="29DD6DC3">
-      <w:pPr>
-        <w:keepNext w:val="0"/>
-        <w:keepLines w:val="0"/>
-        <w:pageBreakBefore w:val="0"/>
-        <w:widowControl w:val="0"/>
-        <w:numPr>
-          <w:ilvl w:val="0"/>
-          <w:numId w:val="0"/>
-        </w:numPr>
-        <w:kinsoku/>
-        <w:wordWrap/>
-        <w:overflowPunct/>
-        <w:topLinePunct w:val="0"/>
-        <w:autoSpaceDE/>
-        <w:autoSpaceDN/>
-        <w:bidi w:val="0"/>
-        <w:adjustRightInd/>
-        <w:snapToGrid/>
-        <w:spacing w:line="480" w:lineRule="auto"/>
-        <w:ind w:left="0" w:leftChars="0" w:firstLine="218" w:firstLineChars="91"/>
-        <w:jc w:val="left"/>
-        <w:textAlignment w:val="auto"/>
-        <w:rPr>
-          <w:rFonts w:hint="default" w:ascii="汉仪中宋简" w:hAnsi="汉仪中宋简" w:eastAsia="汉仪中宋简" w:cs="汉仪中宋简"/>
-          <w:snapToGrid/>
-          <w:kern w:val="2"/>
-          <w:sz w:val="24"/>
-          <w:szCs w:val="24"/>
-          <w:lang w:val="en-US" w:eastAsia="zh-CN"/>
-        </w:rPr>
-      </w:pPr>
-      <w:r>
-        <w:rPr>
-          <w:rFonts w:hint="eastAsia" w:ascii="汉仪中宋简" w:hAnsi="汉仪中宋简" w:eastAsia="汉仪中宋简" w:cs="汉仪中宋简"/>
-          <w:snapToGrid/>
-          <w:kern w:val="2"/>
-          <w:sz w:val="24"/>
-          <w:szCs w:val="24"/>
-          <w:lang w:val="en-US" w:eastAsia="zh-CN"/>
-        </w:rPr>
-        <w:t xml:space="preserve">C. </w:t>
-      </w:r>
-      <w:r>
-        <w:rPr>
-          <w:rFonts w:hint="default" w:ascii="汉仪中宋简" w:hAnsi="汉仪中宋简" w:eastAsia="汉仪中宋简" w:cs="汉仪中宋简"/>
-          <w:snapToGrid/>
-          <w:kern w:val="2"/>
-          <w:sz w:val="24"/>
-          <w:szCs w:val="24"/>
-          <w:lang w:val="en-US" w:eastAsia="zh-CN"/>
-        </w:rPr>
-        <w:t>很少出现，几乎无感觉</w:t>
-      </w:r>
-    </w:p>
-    <w:p ns2:paraId="78517D89">
-      <w:pPr>
-        <w:keepNext w:val="0"/>
-        <w:keepLines w:val="0"/>
-        <w:pageBreakBefore w:val="0"/>
-        <w:widowControl w:val="0"/>
-        <w:numPr>
-          <w:ilvl w:val="0"/>
-          <w:numId w:val="0"/>
-        </w:numPr>
-        <w:kinsoku/>
-        <w:wordWrap/>
-        <w:overflowPunct/>
-        <w:topLinePunct w:val="0"/>
-        <w:autoSpaceDE/>
-        <w:autoSpaceDN/>
-        <w:bidi w:val="0"/>
-        <w:adjustRightInd/>
-        <w:snapToGrid/>
-        <w:spacing w:line="480" w:lineRule="auto"/>
-        <w:ind w:left="0" w:leftChars="0" w:firstLine="218" w:firstLineChars="91"/>
-        <w:jc w:val="left"/>
-        <w:textAlignment w:val="auto"/>
-        <w:rPr>
-          <w:rFonts w:hint="default" w:ascii="汉仪中宋简" w:hAnsi="汉仪中宋简" w:eastAsia="汉仪中宋简" w:cs="汉仪中宋简"/>
-          <w:snapToGrid/>
-          <w:kern w:val="2"/>
-          <w:sz w:val="24"/>
-          <w:szCs w:val="24"/>
-          <w:lang w:val="en-US" w:eastAsia="zh-CN"/>
-        </w:rPr>
-      </w:pPr>
-      <w:r>
-        <w:rPr>
-          <w:rFonts w:hint="eastAsia" w:ascii="汉仪中宋简" w:hAnsi="汉仪中宋简" w:eastAsia="汉仪中宋简" w:cs="汉仪中宋简"/>
-          <w:snapToGrid/>
-          <w:kern w:val="2"/>
-          <w:sz w:val="24"/>
-          <w:szCs w:val="24"/>
-          <w:lang w:val="en-US" w:eastAsia="zh-CN"/>
-        </w:rPr>
-        <w:t xml:space="preserve">D. </w:t>
-      </w:r>
-      <w:r>
-        <w:rPr>
-          <w:rFonts w:hint="default" w:ascii="汉仪中宋简" w:hAnsi="汉仪中宋简" w:eastAsia="汉仪中宋简" w:cs="汉仪中宋简"/>
-          <w:snapToGrid/>
-          <w:kern w:val="2"/>
-          <w:sz w:val="24"/>
-          <w:szCs w:val="24"/>
-          <w:lang w:val="en-US" w:eastAsia="zh-CN"/>
-        </w:rPr>
-        <w:t>从未出现过</w:t>
-      </w:r>
-    </w:p>
-    <w:p ns2:paraId="3CD4510E">
-      <w:pPr>
-        <w:keepNext w:val="0"/>
-        <w:keepLines w:val="0"/>
-        <w:pageBreakBefore w:val="0"/>
-        <w:widowControl w:val="0"/>
-        <w:numPr>
-          <w:ilvl w:val="0"/>
-          <w:numId w:val="9"/>
-        </w:numPr>
-        <w:kinsoku/>
-        <w:wordWrap/>
-        <w:overflowPunct/>
-        <w:topLinePunct w:val="0"/>
-        <w:autoSpaceDE/>
-        <w:autoSpaceDN/>
-        <w:bidi w:val="0"/>
-        <w:adjustRightInd/>
-        <w:snapToGrid/>
-        <w:spacing w:line="480" w:lineRule="auto"/>
-        <w:ind w:left="425" w:leftChars="0" w:hanging="425" w:firstLineChars="0"/>
-        <w:jc w:val="left"/>
-        <w:textAlignment w:val="auto"/>
-        <w:rPr>
-          <w:rFonts w:hint="default" w:ascii="汉仪中宋简" w:hAnsi="汉仪中宋简" w:eastAsia="汉仪中宋简" w:cs="汉仪中宋简"/>
-          <w:snapToGrid/>
-          <w:kern w:val="2"/>
-          <w:sz w:val="24"/>
-          <w:szCs w:val="24"/>
-          <w:lang w:val="en-US" w:eastAsia="zh-CN"/>
-        </w:rPr>
-      </w:pPr>
-      <w:r>
-        <w:rPr>
-          <w:rFonts w:hint="default" w:ascii="汉仪中宋简" w:hAnsi="汉仪中宋简" w:eastAsia="汉仪中宋简" w:cs="汉仪中宋简"/>
-          <w:snapToGrid/>
-          <w:kern w:val="2"/>
-          <w:sz w:val="24"/>
-          <w:szCs w:val="24"/>
-          <w:lang w:val="en-US" w:eastAsia="zh-CN"/>
-        </w:rPr>
-        <w:t>您服用厄贝沙坦氢氯噻嗪片期间，是否出现过口渴、多尿情况？</w:t>
-      </w:r>
-    </w:p>
-    <w:p ns2:paraId="044674F6">
-      <w:pPr>
-        <w:keepNext w:val="0"/>
-        <w:keepLines w:val="0"/>
-        <w:pageBreakBefore w:val="0"/>
-        <w:widowControl w:val="0"/>
-        <w:numPr>
-          <w:ilvl w:val="0"/>
-          <w:numId w:val="0"/>
-        </w:numPr>
-        <w:kinsoku/>
-        <w:wordWrap/>
-        <w:overflowPunct/>
-        <w:topLinePunct w:val="0"/>
-        <w:autoSpaceDE/>
-        <w:autoSpaceDN/>
-        <w:bidi w:val="0"/>
-        <w:adjustRightInd/>
-        <w:snapToGrid/>
-        <w:spacing w:line="480" w:lineRule="auto"/>
-        <w:ind w:left="0" w:leftChars="0" w:firstLine="218" w:firstLineChars="91"/>
-        <w:jc w:val="left"/>
-        <w:textAlignment w:val="auto"/>
-        <w:rPr>
-          <w:rFonts w:hint="default" w:ascii="汉仪中宋简" w:hAnsi="汉仪中宋简" w:eastAsia="汉仪中宋简" w:cs="汉仪中宋简"/>
-          <w:snapToGrid/>
-          <w:kern w:val="2"/>
-          <w:sz w:val="24"/>
-          <w:szCs w:val="24"/>
-          <w:lang w:val="en-US" w:eastAsia="zh-CN"/>
-        </w:rPr>
-      </w:pPr>
-      <w:r>
-        <w:rPr>
-          <w:rFonts w:hint="eastAsia" w:ascii="汉仪中宋简" w:hAnsi="汉仪中宋简" w:eastAsia="汉仪中宋简" w:cs="汉仪中宋简"/>
-          <w:snapToGrid/>
-          <w:kern w:val="2"/>
-          <w:sz w:val="24"/>
-          <w:szCs w:val="24"/>
-          <w:lang w:val="en-US" w:eastAsia="zh-CN"/>
-        </w:rPr>
-        <w:t xml:space="preserve">A. </w:t>
-      </w:r>
-      <w:r>
-        <w:rPr>
-          <w:rFonts w:hint="default" w:ascii="汉仪中宋简" w:hAnsi="汉仪中宋简" w:eastAsia="汉仪中宋简" w:cs="汉仪中宋简"/>
-          <w:snapToGrid/>
-          <w:kern w:val="2"/>
-          <w:sz w:val="24"/>
-          <w:szCs w:val="24"/>
-          <w:lang w:val="en-US" w:eastAsia="zh-CN"/>
-        </w:rPr>
-        <w:t>经常出现，影响正常生活</w:t>
-      </w:r>
-    </w:p>
-    <w:p ns2:paraId="5DD87521">
-      <w:pPr>
-        <w:keepNext w:val="0"/>
-        <w:keepLines w:val="0"/>
-        <w:pageBreakBefore w:val="0"/>
-        <w:widowControl w:val="0"/>
-        <w:numPr>
-          <w:ilvl w:val="0"/>
-          <w:numId w:val="0"/>
-        </w:numPr>
-        <w:kinsoku/>
-        <w:wordWrap/>
-        <w:overflowPunct/>
-        <w:topLinePunct w:val="0"/>
-        <w:autoSpaceDE/>
-        <w:autoSpaceDN/>
-        <w:bidi w:val="0"/>
-        <w:adjustRightInd/>
-        <w:snapToGrid/>
-        <w:spacing w:line="480" w:lineRule="auto"/>
-        <w:ind w:left="0" w:leftChars="0" w:firstLine="218" w:firstLineChars="91"/>
-        <w:jc w:val="left"/>
-        <w:textAlignment w:val="auto"/>
-        <w:rPr>
-          <w:rFonts w:hint="default" w:ascii="汉仪中宋简" w:hAnsi="汉仪中宋简" w:eastAsia="汉仪中宋简" w:cs="汉仪中宋简"/>
-          <w:snapToGrid/>
-          <w:kern w:val="2"/>
-          <w:sz w:val="24"/>
-          <w:szCs w:val="24"/>
-          <w:lang w:val="en-US" w:eastAsia="zh-CN"/>
-        </w:rPr>
-      </w:pPr>
-      <w:r>
-        <w:rPr>
-          <w:rFonts w:hint="eastAsia" w:ascii="汉仪中宋简" w:hAnsi="汉仪中宋简" w:eastAsia="汉仪中宋简" w:cs="汉仪中宋简"/>
-          <w:snapToGrid/>
-          <w:kern w:val="2"/>
-          <w:sz w:val="24"/>
-          <w:szCs w:val="24"/>
-          <w:lang w:val="en-US" w:eastAsia="zh-CN"/>
-        </w:rPr>
-        <w:t xml:space="preserve">B. </w:t>
-      </w:r>
-      <w:r>
-        <w:rPr>
-          <w:rFonts w:hint="default" w:ascii="汉仪中宋简" w:hAnsi="汉仪中宋简" w:eastAsia="汉仪中宋简" w:cs="汉仪中宋简"/>
-          <w:snapToGrid/>
-          <w:kern w:val="2"/>
-          <w:sz w:val="24"/>
-          <w:szCs w:val="24"/>
-          <w:lang w:val="en-US" w:eastAsia="zh-CN"/>
-        </w:rPr>
-        <w:t>偶尔出现，无明显影响</w:t>
-      </w:r>
-    </w:p>
-    <w:p ns2:paraId="407CF38D">
-      <w:pPr>
-        <w:keepNext w:val="0"/>
-        <w:keepLines w:val="0"/>
-        <w:pageBreakBefore w:val="0"/>
-        <w:widowControl w:val="0"/>
-        <w:numPr>
-          <w:ilvl w:val="0"/>
-          <w:numId w:val="0"/>
-        </w:numPr>
-        <w:kinsoku/>
-        <w:wordWrap/>
-        <w:overflowPunct/>
-        <w:topLinePunct w:val="0"/>
-        <w:autoSpaceDE/>
-        <w:autoSpaceDN/>
-        <w:bidi w:val="0"/>
-        <w:adjustRightInd/>
-        <w:snapToGrid/>
-        <w:spacing w:line="480" w:lineRule="auto"/>
-        <w:ind w:left="0" w:leftChars="0" w:firstLine="218" w:firstLineChars="91"/>
-        <w:jc w:val="left"/>
-        <w:textAlignment w:val="auto"/>
-        <w:rPr>
-          <w:rFonts w:hint="default" w:ascii="汉仪中宋简" w:hAnsi="汉仪中宋简" w:eastAsia="汉仪中宋简" w:cs="汉仪中宋简"/>
-          <w:snapToGrid/>
-          <w:kern w:val="2"/>
-          <w:sz w:val="24"/>
-          <w:szCs w:val="24"/>
-          <w:lang w:val="en-US" w:eastAsia="zh-CN"/>
-        </w:rPr>
-      </w:pPr>
-      <w:r>
-        <w:rPr>
-          <w:rFonts w:hint="eastAsia" w:ascii="汉仪中宋简" w:hAnsi="汉仪中宋简" w:eastAsia="汉仪中宋简" w:cs="汉仪中宋简"/>
-          <w:snapToGrid/>
-          <w:kern w:val="2"/>
-          <w:sz w:val="24"/>
-          <w:szCs w:val="24"/>
-          <w:lang w:val="en-US" w:eastAsia="zh-CN"/>
-        </w:rPr>
-        <w:t xml:space="preserve">C. </w:t>
-      </w:r>
-      <w:r>
-        <w:rPr>
-          <w:rFonts w:hint="default" w:ascii="汉仪中宋简" w:hAnsi="汉仪中宋简" w:eastAsia="汉仪中宋简" w:cs="汉仪中宋简"/>
-          <w:snapToGrid/>
-          <w:kern w:val="2"/>
-          <w:sz w:val="24"/>
-          <w:szCs w:val="24"/>
-          <w:lang w:val="en-US" w:eastAsia="zh-CN"/>
-        </w:rPr>
-        <w:t>很少出现，几乎不察觉</w:t>
-      </w:r>
-    </w:p>
-    <w:p ns2:paraId="2245D953">
-      <w:pPr>
-        <w:keepNext w:val="0"/>
-        <w:keepLines w:val="0"/>
-        <w:pageBreakBefore w:val="0"/>
-        <w:widowControl w:val="0"/>
-        <w:numPr>
-          <w:ilvl w:val="0"/>
-          <w:numId w:val="0"/>
-        </w:numPr>
-        <w:kinsoku/>
-        <w:wordWrap/>
-        <w:overflowPunct/>
-        <w:topLinePunct w:val="0"/>
-        <w:autoSpaceDE/>
-        <w:autoSpaceDN/>
-        <w:bidi w:val="0"/>
-        <w:adjustRightInd/>
-        <w:snapToGrid/>
-        <w:spacing w:line="480" w:lineRule="auto"/>
-        <w:ind w:left="0" w:leftChars="0" w:firstLine="218" w:firstLineChars="91"/>
-        <w:jc w:val="left"/>
-        <w:textAlignment w:val="auto"/>
-        <w:rPr>
-          <w:rFonts w:hint="default" w:ascii="汉仪中宋简" w:hAnsi="汉仪中宋简" w:eastAsia="汉仪中宋简" w:cs="汉仪中宋简"/>
-          <w:snapToGrid/>
-          <w:kern w:val="2"/>
-          <w:sz w:val="24"/>
-          <w:szCs w:val="24"/>
-          <w:lang w:val="en-US" w:eastAsia="zh-CN"/>
-        </w:rPr>
-      </w:pPr>
-      <w:r>
-        <w:rPr>
-          <w:rFonts w:hint="eastAsia" w:ascii="汉仪中宋简" w:hAnsi="汉仪中宋简" w:eastAsia="汉仪中宋简" w:cs="汉仪中宋简"/>
-          <w:snapToGrid/>
-          <w:kern w:val="2"/>
-          <w:sz w:val="24"/>
-          <w:szCs w:val="24"/>
-          <w:lang w:val="en-US" w:eastAsia="zh-CN"/>
-        </w:rPr>
-        <w:t xml:space="preserve">D. </w:t>
-      </w:r>
-      <w:r>
-        <w:rPr>
-          <w:rFonts w:hint="default" w:ascii="汉仪中宋简" w:hAnsi="汉仪中宋简" w:eastAsia="汉仪中宋简" w:cs="汉仪中宋简"/>
-          <w:snapToGrid/>
-          <w:kern w:val="2"/>
-          <w:sz w:val="24"/>
-          <w:szCs w:val="24"/>
-          <w:lang w:val="en-US" w:eastAsia="zh-CN"/>
-        </w:rPr>
-        <w:t>从未出现过</w:t>
-      </w:r>
-    </w:p>
-    <w:p ns2:paraId="1BB602CA">
-      <w:pPr>
-        <w:keepNext w:val="0"/>
-        <w:keepLines w:val="0"/>
-        <w:pageBreakBefore w:val="0"/>
-        <w:widowControl w:val="0"/>
-        <w:numPr>
-          <w:ilvl w:val="0"/>
-          <w:numId w:val="9"/>
-        </w:numPr>
-        <w:kinsoku/>
-        <w:wordWrap/>
-        <w:overflowPunct/>
-        <w:topLinePunct w:val="0"/>
-        <w:autoSpaceDE/>
-        <w:autoSpaceDN/>
-        <w:bidi w:val="0"/>
-        <w:adjustRightInd/>
-        <w:snapToGrid/>
-        <w:spacing w:line="480" w:lineRule="auto"/>
-        <w:ind w:left="425" w:leftChars="0" w:hanging="425" w:firstLineChars="0"/>
-        <w:jc w:val="left"/>
-        <w:textAlignment w:val="auto"/>
-        <w:rPr>
-          <w:rFonts w:hint="default" w:ascii="汉仪中宋简" w:hAnsi="汉仪中宋简" w:eastAsia="汉仪中宋简" w:cs="汉仪中宋简"/>
-          <w:snapToGrid/>
-          <w:kern w:val="2"/>
-          <w:sz w:val="24"/>
-          <w:szCs w:val="24"/>
-          <w:lang w:val="en-US" w:eastAsia="zh-CN"/>
-        </w:rPr>
-      </w:pPr>
-      <w:r>
-        <w:rPr>
-          <w:rFonts w:hint="default" w:ascii="汉仪中宋简" w:hAnsi="汉仪中宋简" w:eastAsia="汉仪中宋简" w:cs="汉仪中宋简"/>
-          <w:snapToGrid/>
-          <w:kern w:val="2"/>
-          <w:sz w:val="24"/>
-          <w:szCs w:val="24"/>
-          <w:lang w:val="en-US" w:eastAsia="zh-CN"/>
-        </w:rPr>
-        <w:t>您通常通过什么渠道购买厄贝沙坦氢氯噻嗪片？</w:t>
-      </w:r>
-    </w:p>
-    <w:p ns2:paraId="1091005F">
-      <w:pPr>
-        <w:keepNext w:val="0"/>
-        <w:keepLines w:val="0"/>
-        <w:pageBreakBefore w:val="0"/>
-        <w:widowControl w:val="0"/>
-        <w:numPr>
-          <w:ilvl w:val="0"/>
-          <w:numId w:val="0"/>
-        </w:numPr>
-        <w:kinsoku/>
-        <w:wordWrap/>
-        <w:overflowPunct/>
-        <w:topLinePunct w:val="0"/>
-        <w:autoSpaceDE/>
-        <w:autoSpaceDN/>
-        <w:bidi w:val="0"/>
-        <w:adjustRightInd/>
-        <w:snapToGrid/>
-        <w:spacing w:line="480" w:lineRule="auto"/>
-        <w:ind w:left="0" w:leftChars="0" w:firstLine="218" w:firstLineChars="91"/>
-        <w:jc w:val="left"/>
-        <w:textAlignment w:val="auto"/>
-        <w:rPr>
-          <w:rFonts w:hint="default" w:ascii="汉仪中宋简" w:hAnsi="汉仪中宋简" w:eastAsia="汉仪中宋简" w:cs="汉仪中宋简"/>
-          <w:snapToGrid/>
-          <w:kern w:val="2"/>
-          <w:sz w:val="24"/>
-          <w:szCs w:val="24"/>
-          <w:lang w:val="en-US" w:eastAsia="zh-CN"/>
-        </w:rPr>
-      </w:pPr>
-      <w:r>
-        <w:rPr>
-          <w:rFonts w:hint="eastAsia" w:ascii="汉仪中宋简" w:hAnsi="汉仪中宋简" w:eastAsia="汉仪中宋简" w:cs="汉仪中宋简"/>
-          <w:snapToGrid/>
-          <w:kern w:val="2"/>
-          <w:sz w:val="24"/>
-          <w:szCs w:val="24"/>
-          <w:lang w:val="en-US" w:eastAsia="zh-CN"/>
-        </w:rPr>
-        <w:t xml:space="preserve">A. </w:t>
-      </w:r>
-      <w:r>
-        <w:rPr>
-          <w:rFonts w:hint="default" w:ascii="汉仪中宋简" w:hAnsi="汉仪中宋简" w:eastAsia="汉仪中宋简" w:cs="汉仪中宋简"/>
-          <w:snapToGrid/>
-          <w:kern w:val="2"/>
-          <w:sz w:val="24"/>
-          <w:szCs w:val="24"/>
-          <w:lang w:val="en-US" w:eastAsia="zh-CN"/>
-        </w:rPr>
-        <w:t>医院药房</w:t>
-      </w:r>
-    </w:p>
-    <w:p ns2:paraId="17BF188A">
-      <w:pPr>
-        <w:keepNext w:val="0"/>
-        <w:keepLines w:val="0"/>
-        <w:pageBreakBefore w:val="0"/>
-        <w:widowControl w:val="0"/>
-        <w:numPr>
-          <w:ilvl w:val="0"/>
-          <w:numId w:val="0"/>
-        </w:numPr>
-        <w:kinsoku/>
-        <w:wordWrap/>
-        <w:overflowPunct/>
-        <w:topLinePunct w:val="0"/>
-        <w:autoSpaceDE/>
-        <w:autoSpaceDN/>
-        <w:bidi w:val="0"/>
-        <w:adjustRightInd/>
-        <w:snapToGrid/>
-        <w:spacing w:line="480" w:lineRule="auto"/>
-        <w:ind w:left="0" w:leftChars="0" w:firstLine="218" w:firstLineChars="91"/>
-        <w:jc w:val="left"/>
-        <w:textAlignment w:val="auto"/>
-        <w:rPr>
-          <w:rFonts w:hint="default" w:ascii="汉仪中宋简" w:hAnsi="汉仪中宋简" w:eastAsia="汉仪中宋简" w:cs="汉仪中宋简"/>
-          <w:snapToGrid/>
-          <w:kern w:val="2"/>
-          <w:sz w:val="24"/>
-          <w:szCs w:val="24"/>
-          <w:lang w:val="en-US" w:eastAsia="zh-CN"/>
-        </w:rPr>
-      </w:pPr>
-      <w:r>
-        <w:rPr>
-          <w:rFonts w:hint="eastAsia" w:ascii="汉仪中宋简" w:hAnsi="汉仪中宋简" w:eastAsia="汉仪中宋简" w:cs="汉仪中宋简"/>
-          <w:snapToGrid/>
-          <w:kern w:val="2"/>
-          <w:sz w:val="24"/>
-          <w:szCs w:val="24"/>
-          <w:lang w:val="en-US" w:eastAsia="zh-CN"/>
-        </w:rPr>
-        <w:t xml:space="preserve">B. </w:t>
-      </w:r>
-      <w:r>
-        <w:rPr>
-          <w:rFonts w:hint="default" w:ascii="汉仪中宋简" w:hAnsi="汉仪中宋简" w:eastAsia="汉仪中宋简" w:cs="汉仪中宋简"/>
-          <w:snapToGrid/>
-          <w:kern w:val="2"/>
-          <w:sz w:val="24"/>
-          <w:szCs w:val="24"/>
-          <w:lang w:val="en-US" w:eastAsia="zh-CN"/>
-        </w:rPr>
-        <w:t>线下连锁药店</w:t>
-      </w:r>
-    </w:p>
-    <w:p ns2:paraId="1367894C">
-      <w:pPr>
-        <w:keepNext w:val="0"/>
-        <w:keepLines w:val="0"/>
-        <w:pageBreakBefore w:val="0"/>
-        <w:widowControl w:val="0"/>
-        <w:numPr>
-          <w:ilvl w:val="0"/>
-          <w:numId w:val="0"/>
-        </w:numPr>
-        <w:kinsoku/>
-        <w:wordWrap/>
-        <w:overflowPunct/>
-        <w:topLinePunct w:val="0"/>
-        <w:autoSpaceDE/>
-        <w:autoSpaceDN/>
-        <w:bidi w:val="0"/>
-        <w:adjustRightInd/>
-        <w:snapToGrid/>
-        <w:spacing w:line="480" w:lineRule="auto"/>
-        <w:ind w:left="0" w:leftChars="0" w:firstLine="218" w:firstLineChars="91"/>
-        <w:jc w:val="left"/>
-        <w:textAlignment w:val="auto"/>
-        <w:rPr>
-          <w:rFonts w:hint="default" w:ascii="汉仪中宋简" w:hAnsi="汉仪中宋简" w:eastAsia="汉仪中宋简" w:cs="汉仪中宋简"/>
-          <w:snapToGrid/>
-          <w:kern w:val="2"/>
-          <w:sz w:val="24"/>
-          <w:szCs w:val="24"/>
-          <w:lang w:val="en-US" w:eastAsia="zh-CN"/>
-        </w:rPr>
-      </w:pPr>
-      <w:r>
-        <w:rPr>
-          <w:rFonts w:hint="eastAsia" w:ascii="汉仪中宋简" w:hAnsi="汉仪中宋简" w:eastAsia="汉仪中宋简" w:cs="汉仪中宋简"/>
-          <w:snapToGrid/>
-          <w:kern w:val="2"/>
-          <w:sz w:val="24"/>
-          <w:szCs w:val="24"/>
-          <w:lang w:val="en-US" w:eastAsia="zh-CN"/>
-        </w:rPr>
-        <w:t xml:space="preserve">C. </w:t>
-      </w:r>
-      <w:r>
-        <w:rPr>
-          <w:rFonts w:hint="default" w:ascii="汉仪中宋简" w:hAnsi="汉仪中宋简" w:eastAsia="汉仪中宋简" w:cs="汉仪中宋简"/>
-          <w:snapToGrid/>
-          <w:kern w:val="2"/>
-          <w:sz w:val="24"/>
-          <w:szCs w:val="24"/>
-          <w:lang w:val="en-US" w:eastAsia="zh-CN"/>
-        </w:rPr>
-        <w:t>正规网上药店</w:t>
-      </w:r>
-    </w:p>
-    <w:p ns2:paraId="2E411F45">
-      <w:pPr>
-        <w:keepNext w:val="0"/>
-        <w:keepLines w:val="0"/>
-        <w:pageBreakBefore w:val="0"/>
-        <w:widowControl w:val="0"/>
-        <w:numPr>
-          <w:ilvl w:val="0"/>
-          <w:numId w:val="0"/>
-        </w:numPr>
-        <w:kinsoku/>
-        <w:wordWrap/>
-        <w:overflowPunct/>
-        <w:topLinePunct w:val="0"/>
-        <w:autoSpaceDE/>
-        <w:autoSpaceDN/>
-        <w:bidi w:val="0"/>
-        <w:adjustRightInd/>
-        <w:snapToGrid/>
-        <w:spacing w:line="480" w:lineRule="auto"/>
-        <w:ind w:left="0" w:leftChars="0" w:firstLine="218" w:firstLineChars="91"/>
-        <w:jc w:val="left"/>
-        <w:textAlignment w:val="auto"/>
-        <w:rPr>
-          <w:rFonts w:hint="default" w:ascii="汉仪中宋简" w:hAnsi="汉仪中宋简" w:eastAsia="汉仪中宋简" w:cs="汉仪中宋简"/>
-          <w:snapToGrid/>
-          <w:kern w:val="2"/>
-          <w:sz w:val="24"/>
-          <w:szCs w:val="24"/>
-          <w:lang w:val="en-US" w:eastAsia="zh-CN"/>
-        </w:rPr>
-      </w:pPr>
-      <w:r>
-        <w:rPr>
-          <w:rFonts w:hint="eastAsia" w:ascii="汉仪中宋简" w:hAnsi="汉仪中宋简" w:eastAsia="汉仪中宋简" w:cs="汉仪中宋简"/>
-          <w:snapToGrid/>
-          <w:kern w:val="2"/>
-          <w:sz w:val="24"/>
-          <w:szCs w:val="24"/>
-          <w:lang w:val="en-US" w:eastAsia="zh-CN"/>
-        </w:rPr>
-        <w:t xml:space="preserve">D. </w:t>
-      </w:r>
-      <w:r>
-        <w:rPr>
-          <w:rFonts w:hint="default" w:ascii="汉仪中宋简" w:hAnsi="汉仪中宋简" w:eastAsia="汉仪中宋简" w:cs="汉仪中宋简"/>
-          <w:snapToGrid/>
-          <w:kern w:val="2"/>
-          <w:sz w:val="24"/>
-          <w:szCs w:val="24"/>
-          <w:lang w:val="en-US" w:eastAsia="zh-CN"/>
-        </w:rPr>
-        <w:t>其他渠道（请注明）</w:t>
-      </w:r>
-    </w:p>
-    <w:p ns2:paraId="4A6E75C8">
-      <w:pPr>
-        <w:keepNext w:val="0"/>
-        <w:keepLines w:val="0"/>
-        <w:pageBreakBefore w:val="0"/>
-        <w:widowControl w:val="0"/>
-        <w:numPr>
-          <w:ilvl w:val="0"/>
-          <w:numId w:val="9"/>
-        </w:numPr>
-        <w:kinsoku/>
-        <w:wordWrap/>
-        <w:overflowPunct/>
-        <w:topLinePunct w:val="0"/>
-        <w:autoSpaceDE/>
-        <w:autoSpaceDN/>
-        <w:bidi w:val="0"/>
-        <w:adjustRightInd/>
-        <w:snapToGrid/>
-        <w:spacing w:line="480" w:lineRule="auto"/>
-        <w:ind w:left="425" w:leftChars="0" w:hanging="425" w:firstLineChars="0"/>
-        <w:jc w:val="left"/>
-        <w:textAlignment w:val="auto"/>
-        <w:rPr>
-          <w:rFonts w:hint="default" w:ascii="汉仪中宋简" w:hAnsi="汉仪中宋简" w:eastAsia="汉仪中宋简" w:cs="汉仪中宋简"/>
-          <w:snapToGrid/>
-          <w:kern w:val="2"/>
-          <w:sz w:val="24"/>
-          <w:szCs w:val="24"/>
-          <w:lang w:val="en-US" w:eastAsia="zh-CN"/>
-        </w:rPr>
-      </w:pPr>
-      <w:r>
-        <w:rPr>
-          <w:rFonts w:hint="default" w:ascii="汉仪中宋简" w:hAnsi="汉仪中宋简" w:eastAsia="汉仪中宋简" w:cs="汉仪中宋简"/>
-          <w:snapToGrid/>
-          <w:kern w:val="2"/>
-          <w:sz w:val="24"/>
-          <w:szCs w:val="24"/>
-          <w:lang w:val="en-US" w:eastAsia="zh-CN"/>
-        </w:rPr>
-        <w:t>您认为厄贝沙坦氢氯噻嗪片的价格对您的用药负担影响如何？</w:t>
-      </w:r>
-    </w:p>
-    <w:p ns2:paraId="12BF58ED">
-      <w:pPr>
-        <w:keepNext w:val="0"/>
-        <w:keepLines w:val="0"/>
-        <w:pageBreakBefore w:val="0"/>
-        <w:widowControl w:val="0"/>
-        <w:numPr>
-          <w:ilvl w:val="0"/>
-          <w:numId w:val="0"/>
-        </w:numPr>
-        <w:kinsoku/>
-        <w:wordWrap/>
-        <w:overflowPunct/>
-        <w:topLinePunct w:val="0"/>
-        <w:autoSpaceDE/>
-        <w:autoSpaceDN/>
-        <w:bidi w:val="0"/>
-        <w:adjustRightInd/>
-        <w:snapToGrid/>
-        <w:spacing w:line="480" w:lineRule="auto"/>
-        <w:ind w:left="0" w:leftChars="0" w:firstLine="218" w:firstLineChars="91"/>
-        <w:jc w:val="left"/>
-        <w:textAlignment w:val="auto"/>
-        <w:rPr>
-          <w:rFonts w:hint="default" w:ascii="汉仪中宋简" w:hAnsi="汉仪中宋简" w:eastAsia="汉仪中宋简" w:cs="汉仪中宋简"/>
-          <w:snapToGrid/>
-          <w:kern w:val="2"/>
-          <w:sz w:val="24"/>
-          <w:szCs w:val="24"/>
-          <w:lang w:val="en-US" w:eastAsia="zh-CN"/>
-        </w:rPr>
-      </w:pPr>
-      <w:r>
-        <w:rPr>
-          <w:rFonts w:hint="eastAsia" w:ascii="汉仪中宋简" w:hAnsi="汉仪中宋简" w:eastAsia="汉仪中宋简" w:cs="汉仪中宋简"/>
-          <w:snapToGrid/>
-          <w:kern w:val="2"/>
-          <w:sz w:val="24"/>
-          <w:szCs w:val="24"/>
-          <w:lang w:val="en-US" w:eastAsia="zh-CN"/>
-        </w:rPr>
-        <w:t xml:space="preserve">A. </w:t>
-      </w:r>
-      <w:r>
-        <w:rPr>
-          <w:rFonts w:hint="default" w:ascii="汉仪中宋简" w:hAnsi="汉仪中宋简" w:eastAsia="汉仪中宋简" w:cs="汉仪中宋简"/>
-          <w:snapToGrid/>
-          <w:kern w:val="2"/>
-          <w:sz w:val="24"/>
-          <w:szCs w:val="24"/>
-          <w:lang w:val="en-US" w:eastAsia="zh-CN"/>
-        </w:rPr>
-        <w:t>难以承受</w:t>
-      </w:r>
-    </w:p>
-    <w:p ns2:paraId="7D855842">
-      <w:pPr>
-        <w:keepNext w:val="0"/>
-        <w:keepLines w:val="0"/>
-        <w:pageBreakBefore w:val="0"/>
-        <w:widowControl w:val="0"/>
-        <w:numPr>
-          <w:ilvl w:val="0"/>
-          <w:numId w:val="0"/>
-        </w:numPr>
-        <w:kinsoku/>
-        <w:wordWrap/>
-        <w:overflowPunct/>
-        <w:topLinePunct w:val="0"/>
-        <w:autoSpaceDE/>
-        <w:autoSpaceDN/>
-        <w:bidi w:val="0"/>
-        <w:adjustRightInd/>
-        <w:snapToGrid/>
-        <w:spacing w:line="480" w:lineRule="auto"/>
-        <w:ind w:left="0" w:leftChars="0" w:firstLine="218" w:firstLineChars="91"/>
-        <w:jc w:val="left"/>
-        <w:textAlignment w:val="auto"/>
-        <w:rPr>
-          <w:rFonts w:hint="default" w:ascii="汉仪中宋简" w:hAnsi="汉仪中宋简" w:eastAsia="汉仪中宋简" w:cs="汉仪中宋简"/>
-          <w:snapToGrid/>
-          <w:kern w:val="2"/>
-          <w:sz w:val="24"/>
-          <w:szCs w:val="24"/>
-          <w:lang w:val="en-US" w:eastAsia="zh-CN"/>
-        </w:rPr>
-      </w:pPr>
-      <w:r>
-        <w:rPr>
-          <w:rFonts w:hint="eastAsia" w:ascii="汉仪中宋简" w:hAnsi="汉仪中宋简" w:eastAsia="汉仪中宋简" w:cs="汉仪中宋简"/>
-          <w:snapToGrid/>
-          <w:kern w:val="2"/>
-          <w:sz w:val="24"/>
-          <w:szCs w:val="24"/>
-          <w:lang w:val="en-US" w:eastAsia="zh-CN"/>
-        </w:rPr>
-        <w:t xml:space="preserve">B. </w:t>
-      </w:r>
-      <w:r>
-        <w:rPr>
-          <w:rFonts w:hint="default" w:ascii="汉仪中宋简" w:hAnsi="汉仪中宋简" w:eastAsia="汉仪中宋简" w:cs="汉仪中宋简"/>
-          <w:snapToGrid/>
-          <w:kern w:val="2"/>
-          <w:sz w:val="24"/>
-          <w:szCs w:val="24"/>
-          <w:lang w:val="en-US" w:eastAsia="zh-CN"/>
-        </w:rPr>
-        <w:t>勉强承受</w:t>
-      </w:r>
-    </w:p>
-    <w:p ns2:paraId="6568AEB4">
-      <w:pPr>
-        <w:keepNext w:val="0"/>
-        <w:keepLines w:val="0"/>
-        <w:pageBreakBefore w:val="0"/>
-        <w:widowControl w:val="0"/>
-        <w:numPr>
-          <w:ilvl w:val="0"/>
-          <w:numId w:val="0"/>
-        </w:numPr>
-        <w:kinsoku/>
-        <w:wordWrap/>
-        <w:overflowPunct/>
-        <w:topLinePunct w:val="0"/>
-        <w:autoSpaceDE/>
-        <w:autoSpaceDN/>
-        <w:bidi w:val="0"/>
-        <w:adjustRightInd/>
-        <w:snapToGrid/>
-        <w:spacing w:line="480" w:lineRule="auto"/>
-        <w:ind w:left="0" w:leftChars="0" w:firstLine="218" w:firstLineChars="91"/>
-        <w:jc w:val="left"/>
-        <w:textAlignment w:val="auto"/>
-        <w:rPr>
-          <w:rFonts w:hint="default" w:ascii="汉仪中宋简" w:hAnsi="汉仪中宋简" w:eastAsia="汉仪中宋简" w:cs="汉仪中宋简"/>
-          <w:snapToGrid/>
-          <w:kern w:val="2"/>
-          <w:sz w:val="24"/>
-          <w:szCs w:val="24"/>
-          <w:lang w:val="en-US" w:eastAsia="zh-CN"/>
-        </w:rPr>
-      </w:pPr>
-      <w:r>
-        <w:rPr>
-          <w:rFonts w:hint="eastAsia" w:ascii="汉仪中宋简" w:hAnsi="汉仪中宋简" w:eastAsia="汉仪中宋简" w:cs="汉仪中宋简"/>
-          <w:snapToGrid/>
-          <w:kern w:val="2"/>
-          <w:sz w:val="24"/>
-          <w:szCs w:val="24"/>
-          <w:lang w:val="en-US" w:eastAsia="zh-CN"/>
-        </w:rPr>
-        <w:t xml:space="preserve">C. </w:t>
-      </w:r>
-      <w:r>
-        <w:rPr>
-          <w:rFonts w:hint="default" w:ascii="汉仪中宋简" w:hAnsi="汉仪中宋简" w:eastAsia="汉仪中宋简" w:cs="汉仪中宋简"/>
-          <w:snapToGrid/>
-          <w:kern w:val="2"/>
-          <w:sz w:val="24"/>
-          <w:szCs w:val="24"/>
-          <w:lang w:val="en-US" w:eastAsia="zh-CN"/>
-        </w:rPr>
-        <w:t>在可接受范围</w:t>
-      </w:r>
-    </w:p>
-    <w:p ns2:paraId="75966934">
-      <w:pPr>
-        <w:keepNext w:val="0"/>
-        <w:keepLines w:val="0"/>
-        <w:pageBreakBefore w:val="0"/>
-        <w:widowControl w:val="0"/>
-        <w:numPr>
-          <w:ilvl w:val="0"/>
-          <w:numId w:val="0"/>
-        </w:numPr>
-        <w:kinsoku/>
-        <w:wordWrap/>
-        <w:overflowPunct/>
-        <w:topLinePunct w:val="0"/>
-        <w:autoSpaceDE/>
-        <w:autoSpaceDN/>
-        <w:bidi w:val="0"/>
-        <w:adjustRightInd/>
-        <w:snapToGrid/>
-        <w:spacing w:line="480" w:lineRule="auto"/>
-        <w:ind w:left="0" w:leftChars="0" w:firstLine="218" w:firstLineChars="91"/>
-        <w:jc w:val="left"/>
-        <w:textAlignment w:val="auto"/>
-        <w:rPr>
-          <w:rFonts w:hint="default" w:ascii="汉仪中宋简" w:hAnsi="汉仪中宋简" w:eastAsia="汉仪中宋简" w:cs="汉仪中宋简"/>
-          <w:snapToGrid/>
-          <w:kern w:val="2"/>
-          <w:sz w:val="24"/>
-          <w:szCs w:val="24"/>
-          <w:lang w:val="en-US" w:eastAsia="zh-CN"/>
-        </w:rPr>
-      </w:pPr>
-      <w:r>
-        <w:rPr>
-          <w:rFonts w:hint="eastAsia" w:ascii="汉仪中宋简" w:hAnsi="汉仪中宋简" w:eastAsia="汉仪中宋简" w:cs="汉仪中宋简"/>
-          <w:snapToGrid/>
-          <w:kern w:val="2"/>
-          <w:sz w:val="24"/>
-          <w:szCs w:val="24"/>
-          <w:lang w:val="en-US" w:eastAsia="zh-CN"/>
-        </w:rPr>
-        <w:t xml:space="preserve">D. </w:t>
-      </w:r>
-      <w:r>
-        <w:rPr>
-          <w:rFonts w:hint="default" w:ascii="汉仪中宋简" w:hAnsi="汉仪中宋简" w:eastAsia="汉仪中宋简" w:cs="汉仪中宋简"/>
-          <w:snapToGrid/>
-          <w:kern w:val="2"/>
-          <w:sz w:val="24"/>
-          <w:szCs w:val="24"/>
-          <w:lang w:val="en-US" w:eastAsia="zh-CN"/>
-        </w:rPr>
-        <w:t>无压力</w:t>
-      </w:r>
-    </w:p>
-    <w:p ns2:paraId="5A4BE6E6">
-      <w:pPr>
-        <w:keepNext w:val="0"/>
-        <w:keepLines w:val="0"/>
-        <w:pageBreakBefore w:val="0"/>
-        <w:widowControl w:val="0"/>
-        <w:numPr>
-          <w:ilvl w:val="0"/>
-          <w:numId w:val="9"/>
-        </w:numPr>
-        <w:kinsoku/>
-        <w:wordWrap/>
-        <w:overflowPunct/>
-        <w:topLinePunct w:val="0"/>
-        <w:autoSpaceDE/>
-        <w:autoSpaceDN/>
-        <w:bidi w:val="0"/>
-        <w:adjustRightInd/>
-        <w:snapToGrid/>
-        <w:spacing w:line="480" w:lineRule="auto"/>
-        <w:ind w:left="425" w:leftChars="0" w:hanging="425" w:firstLineChars="0"/>
-        <w:jc w:val="left"/>
-        <w:textAlignment w:val="auto"/>
-        <w:rPr>
-          <w:rFonts w:hint="default" w:ascii="汉仪中宋简" w:hAnsi="汉仪中宋简" w:eastAsia="汉仪中宋简" w:cs="汉仪中宋简"/>
-          <w:snapToGrid/>
-          <w:kern w:val="2"/>
-          <w:sz w:val="24"/>
-          <w:szCs w:val="24"/>
-          <w:lang w:val="en-US" w:eastAsia="zh-CN"/>
-        </w:rPr>
-      </w:pPr>
-      <w:r>
-        <w:rPr>
-          <w:rFonts w:hint="default" w:ascii="汉仪中宋简" w:hAnsi="汉仪中宋简" w:eastAsia="汉仪中宋简" w:cs="汉仪中宋简"/>
-          <w:snapToGrid/>
-          <w:kern w:val="2"/>
-          <w:sz w:val="24"/>
-          <w:szCs w:val="24"/>
-          <w:lang w:val="en-US" w:eastAsia="zh-CN"/>
-        </w:rPr>
-        <w:t>您服用厄贝沙坦氢氯噻嗪片的剂量是否严格按照医嘱？</w:t>
-      </w:r>
-    </w:p>
-    <w:p ns2:paraId="6F7208D9">
-      <w:pPr>
-        <w:keepNext w:val="0"/>
-        <w:keepLines w:val="0"/>
-        <w:pageBreakBefore w:val="0"/>
-        <w:widowControl w:val="0"/>
-        <w:numPr>
-          <w:ilvl w:val="0"/>
-          <w:numId w:val="0"/>
-        </w:numPr>
-        <w:kinsoku/>
-        <w:wordWrap/>
-        <w:overflowPunct/>
-        <w:topLinePunct w:val="0"/>
-        <w:autoSpaceDE/>
-        <w:autoSpaceDN/>
-        <w:bidi w:val="0"/>
-        <w:adjustRightInd/>
-        <w:snapToGrid/>
-        <w:spacing w:line="480" w:lineRule="auto"/>
-        <w:ind w:left="0" w:leftChars="0" w:firstLine="218" w:firstLineChars="91"/>
-        <w:jc w:val="left"/>
-        <w:textAlignment w:val="auto"/>
-        <w:rPr>
-          <w:rFonts w:hint="default" w:ascii="汉仪中宋简" w:hAnsi="汉仪中宋简" w:eastAsia="汉仪中宋简" w:cs="汉仪中宋简"/>
-          <w:snapToGrid/>
-          <w:kern w:val="2"/>
-          <w:sz w:val="24"/>
-          <w:szCs w:val="24"/>
-          <w:lang w:val="en-US" w:eastAsia="zh-CN"/>
-        </w:rPr>
-      </w:pPr>
-      <w:r>
-        <w:rPr>
-          <w:rFonts w:hint="eastAsia" w:ascii="汉仪中宋简" w:hAnsi="汉仪中宋简" w:eastAsia="汉仪中宋简" w:cs="汉仪中宋简"/>
-          <w:snapToGrid/>
-          <w:kern w:val="2"/>
-          <w:sz w:val="24"/>
-          <w:szCs w:val="24"/>
-          <w:lang w:val="en-US" w:eastAsia="zh-CN"/>
-        </w:rPr>
-        <w:t xml:space="preserve">A. </w:t>
-      </w:r>
-      <w:r>
-        <w:rPr>
-          <w:rFonts w:hint="default" w:ascii="汉仪中宋简" w:hAnsi="汉仪中宋简" w:eastAsia="汉仪中宋简" w:cs="汉仪中宋简"/>
-          <w:snapToGrid/>
-          <w:kern w:val="2"/>
-          <w:sz w:val="24"/>
-          <w:szCs w:val="24"/>
-          <w:lang w:val="en-US" w:eastAsia="zh-CN"/>
-        </w:rPr>
-        <w:t>始终严格遵守</w:t>
-      </w:r>
-    </w:p>
-    <w:p ns2:paraId="301BBCB2">
-      <w:pPr>
-        <w:keepNext w:val="0"/>
-        <w:keepLines w:val="0"/>
-        <w:pageBreakBefore w:val="0"/>
-        <w:widowControl w:val="0"/>
-        <w:numPr>
-          <w:ilvl w:val="0"/>
-          <w:numId w:val="0"/>
-        </w:numPr>
-        <w:kinsoku/>
-        <w:wordWrap/>
-        <w:overflowPunct/>
-        <w:topLinePunct w:val="0"/>
-        <w:autoSpaceDE/>
-        <w:autoSpaceDN/>
-        <w:bidi w:val="0"/>
-        <w:adjustRightInd/>
-        <w:snapToGrid/>
-        <w:spacing w:line="480" w:lineRule="auto"/>
-        <w:ind w:left="0" w:leftChars="0" w:firstLine="218" w:firstLineChars="91"/>
-        <w:jc w:val="left"/>
-        <w:textAlignment w:val="auto"/>
-        <w:rPr>
-          <w:rFonts w:hint="default" w:ascii="汉仪中宋简" w:hAnsi="汉仪中宋简" w:eastAsia="汉仪中宋简" w:cs="汉仪中宋简"/>
-          <w:snapToGrid/>
-          <w:kern w:val="2"/>
-          <w:sz w:val="24"/>
-          <w:szCs w:val="24"/>
-          <w:lang w:val="en-US" w:eastAsia="zh-CN"/>
-        </w:rPr>
-      </w:pPr>
-      <w:r>
-        <w:rPr>
-          <w:rFonts w:hint="eastAsia" w:ascii="汉仪中宋简" w:hAnsi="汉仪中宋简" w:eastAsia="汉仪中宋简" w:cs="汉仪中宋简"/>
-          <w:snapToGrid/>
-          <w:kern w:val="2"/>
-          <w:sz w:val="24"/>
-          <w:szCs w:val="24"/>
-          <w:lang w:val="en-US" w:eastAsia="zh-CN"/>
-        </w:rPr>
-        <w:t xml:space="preserve">B. </w:t>
-      </w:r>
-      <w:r>
-        <w:rPr>
-          <w:rFonts w:hint="default" w:ascii="汉仪中宋简" w:hAnsi="汉仪中宋简" w:eastAsia="汉仪中宋简" w:cs="汉仪中宋简"/>
-          <w:snapToGrid/>
-          <w:kern w:val="2"/>
-          <w:sz w:val="24"/>
-          <w:szCs w:val="24"/>
-          <w:lang w:val="en-US" w:eastAsia="zh-CN"/>
-        </w:rPr>
-        <w:t>大部分时间遵守，偶尔微调</w:t>
-      </w:r>
-    </w:p>
-    <w:p ns2:paraId="02514DCE">
-      <w:pPr>
-        <w:keepNext w:val="0"/>
-        <w:keepLines w:val="0"/>
-        <w:pageBreakBefore w:val="0"/>
-        <w:widowControl w:val="0"/>
-        <w:numPr>
-          <w:ilvl w:val="0"/>
-          <w:numId w:val="0"/>
-        </w:numPr>
-        <w:kinsoku/>
-        <w:wordWrap/>
-        <w:overflowPunct/>
-        <w:topLinePunct w:val="0"/>
-        <w:autoSpaceDE/>
-        <w:autoSpaceDN/>
-        <w:bidi w:val="0"/>
-        <w:adjustRightInd/>
-        <w:snapToGrid/>
-        <w:spacing w:line="480" w:lineRule="auto"/>
-        <w:ind w:left="0" w:leftChars="0" w:firstLine="218" w:firstLineChars="91"/>
-        <w:jc w:val="left"/>
-        <w:textAlignment w:val="auto"/>
-        <w:rPr>
-          <w:rFonts w:hint="default" w:ascii="汉仪中宋简" w:hAnsi="汉仪中宋简" w:eastAsia="汉仪中宋简" w:cs="汉仪中宋简"/>
-          <w:snapToGrid/>
-          <w:kern w:val="2"/>
-          <w:sz w:val="24"/>
-          <w:szCs w:val="24"/>
-          <w:lang w:val="en-US" w:eastAsia="zh-CN"/>
-        </w:rPr>
-      </w:pPr>
-      <w:r>
-        <w:rPr>
-          <w:rFonts w:hint="eastAsia" w:ascii="汉仪中宋简" w:hAnsi="汉仪中宋简" w:eastAsia="汉仪中宋简" w:cs="汉仪中宋简"/>
-          <w:snapToGrid/>
-          <w:kern w:val="2"/>
-          <w:sz w:val="24"/>
-          <w:szCs w:val="24"/>
-          <w:lang w:val="en-US" w:eastAsia="zh-CN"/>
-        </w:rPr>
-        <w:t xml:space="preserve">C. </w:t>
-      </w:r>
-      <w:r>
-        <w:rPr>
-          <w:rFonts w:hint="default" w:ascii="汉仪中宋简" w:hAnsi="汉仪中宋简" w:eastAsia="汉仪中宋简" w:cs="汉仪中宋简"/>
-          <w:snapToGrid/>
-          <w:kern w:val="2"/>
-          <w:sz w:val="24"/>
-          <w:szCs w:val="24"/>
-          <w:lang w:val="en-US" w:eastAsia="zh-CN"/>
-        </w:rPr>
-        <w:t>经常根据自身感觉调整</w:t>
-      </w:r>
-    </w:p>
-    <w:p ns2:paraId="2FDCE85C">
-      <w:pPr>
-        <w:keepNext w:val="0"/>
-        <w:keepLines w:val="0"/>
-        <w:pageBreakBefore w:val="0"/>
-        <w:widowControl w:val="0"/>
-        <w:numPr>
-          <w:ilvl w:val="0"/>
-          <w:numId w:val="0"/>
-        </w:numPr>
-        <w:kinsoku/>
-        <w:wordWrap/>
-        <w:overflowPunct/>
-        <w:topLinePunct w:val="0"/>
-        <w:autoSpaceDE/>
-        <w:autoSpaceDN/>
-        <w:bidi w:val="0"/>
-        <w:adjustRightInd/>
-        <w:snapToGrid/>
-        <w:spacing w:line="480" w:lineRule="auto"/>
-        <w:ind w:left="0" w:leftChars="0" w:firstLine="218" w:firstLineChars="91"/>
-        <w:jc w:val="left"/>
-        <w:textAlignment w:val="auto"/>
-        <w:rPr>
-          <w:rFonts w:hint="eastAsia" w:ascii="汉仪中宋简" w:hAnsi="汉仪中宋简" w:eastAsia="汉仪中宋简" w:cs="汉仪中宋简"/>
-          <w:snapToGrid/>
-          <w:kern w:val="2"/>
-          <w:sz w:val="24"/>
-          <w:szCs w:val="24"/>
-          <w:lang w:val="en-US" w:eastAsia="zh-CN"/>
-        </w:rPr>
-      </w:pPr>
-      <w:r>
-        <w:rPr>
-          <w:rFonts w:hint="eastAsia" w:ascii="汉仪中宋简" w:hAnsi="汉仪中宋简" w:eastAsia="汉仪中宋简" w:cs="汉仪中宋简"/>
-          <w:snapToGrid/>
-          <w:kern w:val="2"/>
-          <w:sz w:val="24"/>
-          <w:szCs w:val="24"/>
-          <w:lang w:val="en-US" w:eastAsia="zh-CN"/>
-        </w:rPr>
-        <w:t xml:space="preserve">D. </w:t>
-      </w:r>
-      <w:r>
-        <w:rPr>
-          <w:rFonts w:hint="default" w:ascii="汉仪中宋简" w:hAnsi="汉仪中宋简" w:eastAsia="汉仪中宋简" w:cs="汉仪中宋简"/>
-          <w:snapToGrid/>
-          <w:kern w:val="2"/>
-          <w:sz w:val="24"/>
-          <w:szCs w:val="24"/>
-          <w:lang w:val="en-US" w:eastAsia="zh-CN"/>
-        </w:rPr>
-        <w:t>从未按规定剂量服用</w:t>
-      </w:r>
-    </w:p>
-    <w:p ns2:paraId="3C8B964E">
-      <w:pPr>
-        <w:keepNext w:val="0"/>
-        <w:keepLines w:val="0"/>
-        <w:pageBreakBefore w:val="0"/>
-        <w:widowControl w:val="0"/>
-        <w:numPr>
-          <w:ilvl w:val="0"/>
-          <w:numId w:val="9"/>
-        </w:numPr>
-        <w:kinsoku/>
-        <w:wordWrap/>
-        <w:overflowPunct/>
-        <w:topLinePunct w:val="0"/>
-        <w:autoSpaceDE/>
-        <w:autoSpaceDN/>
-        <w:bidi w:val="0"/>
-        <w:adjustRightInd/>
-        <w:snapToGrid/>
-        <w:spacing w:line="480" w:lineRule="auto"/>
-        <w:ind w:left="425" w:leftChars="0" w:hanging="425" w:firstLineChars="0"/>
-        <w:jc w:val="left"/>
-        <w:textAlignment w:val="auto"/>
-        <w:rPr>
-          <w:rFonts w:hint="default" w:ascii="汉仪中宋简" w:hAnsi="汉仪中宋简" w:eastAsia="汉仪中宋简" w:cs="汉仪中宋简"/>
-          <w:snapToGrid/>
-          <w:kern w:val="2"/>
-          <w:sz w:val="24"/>
-          <w:szCs w:val="24"/>
-          <w:lang w:val="en-US" w:eastAsia="zh-CN"/>
-        </w:rPr>
-      </w:pPr>
-      <w:r>
-        <w:rPr>
-          <w:rFonts w:hint="default" w:ascii="汉仪中宋简" w:hAnsi="汉仪中宋简" w:eastAsia="汉仪中宋简" w:cs="汉仪中宋简"/>
-          <w:snapToGrid/>
-          <w:kern w:val="2"/>
-          <w:sz w:val="24"/>
-          <w:szCs w:val="24"/>
-          <w:lang w:val="en-US" w:eastAsia="zh-CN"/>
-        </w:rPr>
-        <w:t>您对厄贝沙坦氢氯噻嗪片的服药频率满意度如何？</w:t>
-      </w:r>
-    </w:p>
-    <w:p ns2:paraId="21EE6A01">
-      <w:pPr>
-        <w:keepNext w:val="0"/>
-        <w:keepLines w:val="0"/>
-        <w:pageBreakBefore w:val="0"/>
-        <w:widowControl w:val="0"/>
-        <w:numPr>
-          <w:ilvl w:val="0"/>
-          <w:numId w:val="10"/>
-        </w:numPr>
-        <w:kinsoku/>
-        <w:wordWrap/>
-        <w:overflowPunct/>
-        <w:topLinePunct w:val="0"/>
-        <w:autoSpaceDE/>
-        <w:autoSpaceDN/>
-        <w:bidi w:val="0"/>
-        <w:adjustRightInd/>
-        <w:snapToGrid/>
-        <w:spacing w:line="480" w:lineRule="auto"/>
-        <w:ind w:left="0" w:leftChars="0" w:firstLine="218" w:firstLineChars="91"/>
-        <w:jc w:val="left"/>
-        <w:textAlignment w:val="auto"/>
-        <w:rPr>
-          <w:rFonts w:hint="default" w:ascii="汉仪中宋简" w:hAnsi="汉仪中宋简" w:eastAsia="汉仪中宋简" w:cs="汉仪中宋简"/>
-          <w:snapToGrid/>
-          <w:kern w:val="2"/>
-          <w:sz w:val="24"/>
-          <w:szCs w:val="24"/>
-          <w:lang w:val="en-US" w:eastAsia="zh-CN"/>
-        </w:rPr>
-      </w:pPr>
-      <w:r>
-        <w:rPr>
-          <w:rFonts w:hint="default" w:ascii="汉仪中宋简" w:hAnsi="汉仪中宋简" w:eastAsia="汉仪中宋简" w:cs="汉仪中宋简"/>
-          <w:snapToGrid/>
-          <w:kern w:val="2"/>
-          <w:sz w:val="24"/>
-          <w:szCs w:val="24"/>
-          <w:lang w:val="en-US" w:eastAsia="zh-CN"/>
-        </w:rPr>
-        <w:t>频率很合适，按要求吃很轻松</w:t>
-      </w:r>
-    </w:p>
-    <w:p ns2:paraId="6D967439">
-      <w:pPr>
-        <w:keepNext w:val="0"/>
-        <w:keepLines w:val="0"/>
-        <w:pageBreakBefore w:val="0"/>
-        <w:widowControl w:val="0"/>
-        <w:numPr>
-          <w:ilvl w:val="0"/>
-          <w:numId w:val="10"/>
-        </w:numPr>
-        <w:kinsoku/>
-        <w:wordWrap/>
-        <w:overflowPunct/>
-        <w:topLinePunct w:val="0"/>
-        <w:autoSpaceDE/>
-        <w:autoSpaceDN/>
-        <w:bidi w:val="0"/>
-        <w:adjustRightInd/>
-        <w:snapToGrid/>
-        <w:spacing w:line="480" w:lineRule="auto"/>
-        <w:ind w:left="0" w:leftChars="0" w:firstLine="218" w:firstLineChars="91"/>
-        <w:jc w:val="left"/>
-        <w:textAlignment w:val="auto"/>
-        <w:rPr>
-          <w:rFonts w:hint="default" w:ascii="汉仪中宋简" w:hAnsi="汉仪中宋简" w:eastAsia="汉仪中宋简" w:cs="汉仪中宋简"/>
-          <w:snapToGrid/>
-          <w:kern w:val="2"/>
-          <w:sz w:val="24"/>
-          <w:szCs w:val="24"/>
-          <w:lang w:val="en-US" w:eastAsia="zh-CN"/>
-        </w:rPr>
-      </w:pPr>
-      <w:r>
-        <w:rPr>
-          <w:rFonts w:hint="default" w:ascii="汉仪中宋简" w:hAnsi="汉仪中宋简" w:eastAsia="汉仪中宋简" w:cs="汉仪中宋简"/>
-          <w:snapToGrid/>
-          <w:kern w:val="2"/>
-          <w:sz w:val="24"/>
-          <w:szCs w:val="24"/>
-          <w:lang w:val="en-US" w:eastAsia="zh-CN"/>
-        </w:rPr>
-        <w:t>频率还可以，没对生活造成困扰</w:t>
-      </w:r>
-    </w:p>
-    <w:p ns2:paraId="4411C818">
-      <w:pPr>
-        <w:keepNext w:val="0"/>
-        <w:keepLines w:val="0"/>
-        <w:pageBreakBefore w:val="0"/>
-        <w:widowControl w:val="0"/>
-        <w:numPr>
-          <w:ilvl w:val="0"/>
-          <w:numId w:val="10"/>
-        </w:numPr>
-        <w:kinsoku/>
-        <w:wordWrap/>
-        <w:overflowPunct/>
-        <w:topLinePunct w:val="0"/>
-        <w:autoSpaceDE/>
-        <w:autoSpaceDN/>
-        <w:bidi w:val="0"/>
-        <w:adjustRightInd/>
-        <w:snapToGrid/>
-        <w:spacing w:line="480" w:lineRule="auto"/>
-        <w:ind w:left="0" w:leftChars="0" w:firstLine="218" w:firstLineChars="91"/>
-        <w:jc w:val="left"/>
-        <w:textAlignment w:val="auto"/>
-        <w:rPr>
-          <w:rFonts w:hint="default" w:ascii="汉仪中宋简" w:hAnsi="汉仪中宋简" w:eastAsia="汉仪中宋简" w:cs="汉仪中宋简"/>
-          <w:snapToGrid/>
-          <w:kern w:val="2"/>
-          <w:sz w:val="24"/>
-          <w:szCs w:val="24"/>
-          <w:lang w:val="en-US" w:eastAsia="zh-CN"/>
-        </w:rPr>
-      </w:pPr>
-      <w:r>
-        <w:rPr>
-          <w:rFonts w:hint="default" w:ascii="汉仪中宋简" w:hAnsi="汉仪中宋简" w:eastAsia="汉仪中宋简" w:cs="汉仪中宋简"/>
-          <w:snapToGrid/>
-          <w:kern w:val="2"/>
-          <w:sz w:val="24"/>
-          <w:szCs w:val="24"/>
-          <w:lang w:val="en-US" w:eastAsia="zh-CN"/>
-        </w:rPr>
-        <w:t>频率稍微有点高，偶尔会记不清</w:t>
-      </w:r>
-    </w:p>
-    <w:p ns2:paraId="35B610CD">
-      <w:pPr>
-        <w:keepNext w:val="0"/>
-        <w:keepLines w:val="0"/>
-        <w:pageBreakBefore w:val="0"/>
-        <w:widowControl w:val="0"/>
-        <w:numPr>
-          <w:ilvl w:val="0"/>
-          <w:numId w:val="10"/>
-        </w:numPr>
-        <w:kinsoku/>
-        <w:wordWrap/>
-        <w:overflowPunct/>
-        <w:topLinePunct w:val="0"/>
-        <w:autoSpaceDE/>
-        <w:autoSpaceDN/>
-        <w:bidi w:val="0"/>
-        <w:adjustRightInd/>
-        <w:snapToGrid/>
-        <w:spacing w:line="480" w:lineRule="auto"/>
-        <w:ind w:left="0" w:leftChars="0" w:firstLine="218" w:firstLineChars="91"/>
-        <w:jc w:val="left"/>
-        <w:textAlignment w:val="auto"/>
-        <w:rPr>
-          <w:rFonts w:hint="default" w:ascii="汉仪中宋简" w:hAnsi="汉仪中宋简" w:eastAsia="汉仪中宋简" w:cs="汉仪中宋简"/>
-          <w:snapToGrid/>
-          <w:kern w:val="2"/>
-          <w:sz w:val="24"/>
-          <w:szCs w:val="24"/>
-          <w:lang w:val="en-US" w:eastAsia="zh-CN"/>
-        </w:rPr>
-      </w:pPr>
-      <w:r>
-        <w:rPr>
-          <w:rFonts w:hint="default" w:ascii="汉仪中宋简" w:hAnsi="汉仪中宋简" w:eastAsia="汉仪中宋简" w:cs="汉仪中宋简"/>
-          <w:snapToGrid/>
-          <w:kern w:val="2"/>
-          <w:sz w:val="24"/>
-          <w:szCs w:val="24"/>
-          <w:lang w:val="en-US" w:eastAsia="zh-CN"/>
-        </w:rPr>
-        <w:t>频率不太适应，想过调整一下</w:t>
-      </w:r>
-    </w:p>
-    <w:p ns2:paraId="6B0ADD53">
-      <w:pPr>
-        <w:keepNext w:val="0"/>
-        <w:keepLines w:val="0"/>
-        <w:pageBreakBefore w:val="0"/>
-        <w:widowControl w:val="0"/>
-        <w:numPr>
-          <w:ilvl w:val="0"/>
-          <w:numId w:val="9"/>
-        </w:numPr>
-        <w:kinsoku/>
-        <w:wordWrap/>
-        <w:overflowPunct/>
-        <w:topLinePunct w:val="0"/>
-        <w:autoSpaceDE/>
-        <w:autoSpaceDN/>
-        <w:bidi w:val="0"/>
-        <w:adjustRightInd/>
-        <w:snapToGrid/>
-        <w:spacing w:line="480" w:lineRule="auto"/>
-        <w:ind w:left="425" w:leftChars="0" w:hanging="425" w:firstLineChars="0"/>
-        <w:jc w:val="left"/>
-        <w:textAlignment w:val="auto"/>
-        <w:rPr>
-          <w:rFonts w:hint="default" w:ascii="汉仪中宋简" w:hAnsi="汉仪中宋简" w:eastAsia="汉仪中宋简" w:cs="汉仪中宋简"/>
-          <w:snapToGrid/>
-          <w:kern w:val="2"/>
-          <w:sz w:val="24"/>
-          <w:szCs w:val="24"/>
-          <w:lang w:val="en-US" w:eastAsia="zh-CN"/>
-        </w:rPr>
-      </w:pPr>
-      <w:r>
-        <w:rPr>
-          <w:rFonts w:hint="default" w:ascii="汉仪中宋简" w:hAnsi="汉仪中宋简" w:eastAsia="汉仪中宋简" w:cs="汉仪中宋简"/>
-          <w:snapToGrid/>
-          <w:kern w:val="2"/>
-          <w:sz w:val="24"/>
-          <w:szCs w:val="24"/>
-          <w:lang w:val="en-US" w:eastAsia="zh-CN"/>
-        </w:rPr>
-        <w:t>您服用厄贝沙坦氢氯噻嗪片期间，是否同时服用其他降压药物？</w:t>
-      </w:r>
-    </w:p>
-    <w:p ns2:paraId="785C0DD9">
-      <w:pPr>
-        <w:keepNext w:val="0"/>
-        <w:keepLines w:val="0"/>
-        <w:pageBreakBefore w:val="0"/>
-        <w:widowControl w:val="0"/>
-        <w:numPr>
-          <w:ilvl w:val="0"/>
-          <w:numId w:val="11"/>
-        </w:numPr>
-        <w:kinsoku/>
-        <w:wordWrap/>
-        <w:overflowPunct/>
-        <w:topLinePunct w:val="0"/>
-        <w:autoSpaceDE/>
-        <w:autoSpaceDN/>
-        <w:bidi w:val="0"/>
-        <w:adjustRightInd/>
-        <w:snapToGrid/>
-        <w:spacing w:line="480" w:lineRule="auto"/>
-        <w:ind w:left="0" w:leftChars="0" w:firstLine="218" w:firstLineChars="91"/>
-        <w:jc w:val="left"/>
-        <w:textAlignment w:val="auto"/>
-        <w:rPr>
-          <w:rFonts w:hint="default" w:ascii="汉仪中宋简" w:hAnsi="汉仪中宋简" w:eastAsia="汉仪中宋简" w:cs="汉仪中宋简"/>
-          <w:snapToGrid/>
-          <w:kern w:val="2"/>
-          <w:sz w:val="24"/>
-          <w:szCs w:val="24"/>
-          <w:lang w:val="en-US" w:eastAsia="zh-CN"/>
-        </w:rPr>
-      </w:pPr>
-      <w:r>
-        <w:rPr>
-          <w:rFonts w:hint="default" w:ascii="汉仪中宋简" w:hAnsi="汉仪中宋简" w:eastAsia="汉仪中宋简" w:cs="汉仪中宋简"/>
-          <w:snapToGrid/>
-          <w:kern w:val="2"/>
-          <w:sz w:val="24"/>
-          <w:szCs w:val="24"/>
-          <w:lang w:val="en-US" w:eastAsia="zh-CN"/>
-        </w:rPr>
-        <w:t>同时服用 1 种其他降压药</w:t>
-      </w:r>
-    </w:p>
-    <w:p ns2:paraId="18BDF8E6">
-      <w:pPr>
-        <w:keepNext w:val="0"/>
-        <w:keepLines w:val="0"/>
-        <w:pageBreakBefore w:val="0"/>
-        <w:widowControl w:val="0"/>
-        <w:numPr>
-          <w:ilvl w:val="0"/>
-          <w:numId w:val="11"/>
-        </w:numPr>
-        <w:kinsoku/>
-        <w:wordWrap/>
-        <w:overflowPunct/>
-        <w:topLinePunct w:val="0"/>
-        <w:autoSpaceDE/>
-        <w:autoSpaceDN/>
-        <w:bidi w:val="0"/>
-        <w:adjustRightInd/>
-        <w:snapToGrid/>
-        <w:spacing w:line="480" w:lineRule="auto"/>
-        <w:ind w:left="0" w:leftChars="0" w:firstLine="218" w:firstLineChars="91"/>
-        <w:jc w:val="left"/>
-        <w:textAlignment w:val="auto"/>
-        <w:rPr>
-          <w:rFonts w:hint="default" w:ascii="汉仪中宋简" w:hAnsi="汉仪中宋简" w:eastAsia="汉仪中宋简" w:cs="汉仪中宋简"/>
-          <w:snapToGrid/>
-          <w:kern w:val="2"/>
-          <w:sz w:val="24"/>
-          <w:szCs w:val="24"/>
-          <w:lang w:val="en-US" w:eastAsia="zh-CN"/>
-        </w:rPr>
-      </w:pPr>
-      <w:r>
-        <w:rPr>
-          <w:rFonts w:hint="default" w:ascii="汉仪中宋简" w:hAnsi="汉仪中宋简" w:eastAsia="汉仪中宋简" w:cs="汉仪中宋简"/>
-          <w:snapToGrid/>
-          <w:kern w:val="2"/>
-          <w:sz w:val="24"/>
-          <w:szCs w:val="24"/>
-          <w:lang w:val="en-US" w:eastAsia="zh-CN"/>
-        </w:rPr>
-        <w:t>同时服用 2 种及以上其他降压药</w:t>
-      </w:r>
-    </w:p>
-    <w:p ns2:paraId="0E01FA29">
-      <w:pPr>
-        <w:keepNext w:val="0"/>
-        <w:keepLines w:val="0"/>
-        <w:pageBreakBefore w:val="0"/>
-        <w:widowControl w:val="0"/>
-        <w:numPr>
-          <w:ilvl w:val="0"/>
-          <w:numId w:val="11"/>
-        </w:numPr>
-        <w:kinsoku/>
-        <w:wordWrap/>
-        <w:overflowPunct/>
-        <w:topLinePunct w:val="0"/>
-        <w:autoSpaceDE/>
-        <w:autoSpaceDN/>
-        <w:bidi w:val="0"/>
-        <w:adjustRightInd/>
-        <w:snapToGrid/>
-        <w:spacing w:line="480" w:lineRule="auto"/>
-        <w:ind w:left="0" w:leftChars="0" w:firstLine="218" w:firstLineChars="91"/>
-        <w:jc w:val="left"/>
-        <w:textAlignment w:val="auto"/>
-        <w:rPr>
-          <w:rFonts w:hint="default" w:ascii="汉仪中宋简" w:hAnsi="汉仪中宋简" w:eastAsia="汉仪中宋简" w:cs="汉仪中宋简"/>
-          <w:snapToGrid/>
-          <w:kern w:val="2"/>
-          <w:sz w:val="24"/>
-          <w:szCs w:val="24"/>
-          <w:lang w:val="en-US" w:eastAsia="zh-CN"/>
-        </w:rPr>
-      </w:pPr>
-      <w:r>
-        <w:rPr>
-          <w:rFonts w:hint="default" w:ascii="汉仪中宋简" w:hAnsi="汉仪中宋简" w:eastAsia="汉仪中宋简" w:cs="汉仪中宋简"/>
-          <w:snapToGrid/>
-          <w:kern w:val="2"/>
-          <w:sz w:val="24"/>
-          <w:szCs w:val="24"/>
-          <w:lang w:val="en-US" w:eastAsia="zh-CN"/>
-        </w:rPr>
-        <w:t>同时服用降压药及其他疾病治疗药物</w:t>
-      </w:r>
-    </w:p>
-    <w:p ns2:paraId="3627E7B2">
-      <w:pPr>
-        <w:keepNext w:val="0"/>
-        <w:keepLines w:val="0"/>
-        <w:pageBreakBefore w:val="0"/>
-        <w:widowControl w:val="0"/>
-        <w:numPr>
-          <w:ilvl w:val="0"/>
-          <w:numId w:val="11"/>
-        </w:numPr>
-        <w:kinsoku/>
-        <w:wordWrap/>
-        <w:overflowPunct/>
-        <w:topLinePunct w:val="0"/>
-        <w:autoSpaceDE/>
-        <w:autoSpaceDN/>
-        <w:bidi w:val="0"/>
-        <w:adjustRightInd/>
-        <w:snapToGrid/>
-        <w:spacing w:line="480" w:lineRule="auto"/>
-        <w:ind w:left="0" w:leftChars="0" w:firstLine="218" w:firstLineChars="91"/>
-        <w:jc w:val="left"/>
-        <w:textAlignment w:val="auto"/>
-        <w:rPr>
-          <w:rFonts w:hint="default" w:ascii="汉仪中宋简" w:hAnsi="汉仪中宋简" w:eastAsia="汉仪中宋简" w:cs="汉仪中宋简"/>
-          <w:snapToGrid/>
-          <w:kern w:val="2"/>
-          <w:sz w:val="24"/>
-          <w:szCs w:val="24"/>
-          <w:lang w:val="en-US" w:eastAsia="zh-CN"/>
-        </w:rPr>
-      </w:pPr>
-      <w:r>
-        <w:rPr>
-          <w:rFonts w:hint="default" w:ascii="汉仪中宋简" w:hAnsi="汉仪中宋简" w:eastAsia="汉仪中宋简" w:cs="汉仪中宋简"/>
-          <w:snapToGrid/>
-          <w:kern w:val="2"/>
-          <w:sz w:val="24"/>
-          <w:szCs w:val="24"/>
-          <w:lang w:val="en-US" w:eastAsia="zh-CN"/>
-        </w:rPr>
-        <w:t>仅服用该药物</w:t>
-      </w:r>
-    </w:p>
-    <w:p ns2:paraId="24C53AFE">
-      <w:pPr>
-        <w:keepNext w:val="0"/>
-        <w:keepLines w:val="0"/>
-        <w:pageBreakBefore w:val="0"/>
-        <w:widowControl w:val="0"/>
-        <w:numPr>
-          <w:ilvl w:val="0"/>
-          <w:numId w:val="9"/>
-        </w:numPr>
-        <w:kinsoku/>
-        <w:wordWrap/>
-        <w:overflowPunct/>
-        <w:topLinePunct w:val="0"/>
-        <w:autoSpaceDE/>
-        <w:autoSpaceDN/>
-        <w:bidi w:val="0"/>
-        <w:adjustRightInd/>
-        <w:snapToGrid/>
-        <w:spacing w:line="480" w:lineRule="auto"/>
-        <w:ind w:left="425" w:leftChars="0" w:hanging="425" w:firstLineChars="0"/>
-        <w:jc w:val="left"/>
-        <w:textAlignment w:val="auto"/>
-        <w:rPr>
-          <w:rFonts w:hint="default" w:ascii="汉仪中宋简" w:hAnsi="汉仪中宋简" w:eastAsia="汉仪中宋简" w:cs="汉仪中宋简"/>
-          <w:snapToGrid/>
-          <w:kern w:val="2"/>
-          <w:sz w:val="24"/>
-          <w:szCs w:val="24"/>
-          <w:lang w:val="en-US" w:eastAsia="zh-CN"/>
-        </w:rPr>
-      </w:pPr>
-      <w:r>
-        <w:rPr>
-          <w:rFonts w:hint="default" w:ascii="汉仪中宋简" w:hAnsi="汉仪中宋简" w:eastAsia="汉仪中宋简" w:cs="汉仪中宋简"/>
-          <w:snapToGrid/>
-          <w:kern w:val="2"/>
-          <w:sz w:val="24"/>
-          <w:szCs w:val="24"/>
-          <w:lang w:val="en-US" w:eastAsia="zh-CN"/>
-        </w:rPr>
-        <w:t>您是否咨询过医生，确认厄贝沙坦氢氯噻嗪片与其他药物可同时服用？</w:t>
-      </w:r>
-    </w:p>
-    <w:p ns2:paraId="2A751218">
-      <w:pPr>
-        <w:keepNext w:val="0"/>
-        <w:keepLines w:val="0"/>
-        <w:pageBreakBefore w:val="0"/>
-        <w:widowControl w:val="0"/>
-        <w:numPr>
-          <w:ilvl w:val="0"/>
-          <w:numId w:val="0"/>
-        </w:numPr>
-        <w:kinsoku/>
-        <w:wordWrap/>
-        <w:overflowPunct/>
-        <w:topLinePunct w:val="0"/>
-        <w:autoSpaceDE/>
-        <w:autoSpaceDN/>
-        <w:bidi w:val="0"/>
-        <w:adjustRightInd/>
-        <w:snapToGrid/>
-        <w:spacing w:line="480" w:lineRule="auto"/>
-        <w:ind w:left="0" w:leftChars="0" w:firstLine="218" w:firstLineChars="91"/>
-        <w:jc w:val="left"/>
-        <w:textAlignment w:val="auto"/>
-        <w:rPr>
-          <w:rFonts w:hint="default" w:ascii="汉仪中宋简" w:hAnsi="汉仪中宋简" w:eastAsia="汉仪中宋简" w:cs="汉仪中宋简"/>
-          <w:snapToGrid/>
-          <w:kern w:val="2"/>
-          <w:sz w:val="24"/>
-          <w:szCs w:val="24"/>
-          <w:lang w:val="en-US" w:eastAsia="zh-CN"/>
-        </w:rPr>
-      </w:pPr>
-      <w:r>
-        <w:rPr>
-          <w:rFonts w:hint="eastAsia" w:ascii="汉仪中宋简" w:hAnsi="汉仪中宋简" w:eastAsia="汉仪中宋简" w:cs="汉仪中宋简"/>
-          <w:snapToGrid/>
-          <w:kern w:val="2"/>
-          <w:sz w:val="24"/>
-          <w:szCs w:val="24"/>
-          <w:lang w:val="en-US" w:eastAsia="zh-CN"/>
-        </w:rPr>
-        <w:t xml:space="preserve">A. </w:t>
-      </w:r>
-      <w:r>
-        <w:rPr>
-          <w:rFonts w:hint="default" w:ascii="汉仪中宋简" w:hAnsi="汉仪中宋简" w:eastAsia="汉仪中宋简" w:cs="汉仪中宋简"/>
-          <w:snapToGrid/>
-          <w:kern w:val="2"/>
-          <w:sz w:val="24"/>
-          <w:szCs w:val="24"/>
-          <w:lang w:val="en-US" w:eastAsia="zh-CN"/>
-        </w:rPr>
-        <w:t>专门咨询过，确认无冲突</w:t>
-      </w:r>
-    </w:p>
-    <w:p ns2:paraId="2CA52B37">
-      <w:pPr>
-        <w:keepNext w:val="0"/>
-        <w:keepLines w:val="0"/>
-        <w:pageBreakBefore w:val="0"/>
-        <w:widowControl w:val="0"/>
-        <w:numPr>
-          <w:ilvl w:val="0"/>
-          <w:numId w:val="0"/>
-        </w:numPr>
-        <w:kinsoku/>
-        <w:wordWrap/>
-        <w:overflowPunct/>
-        <w:topLinePunct w:val="0"/>
-        <w:autoSpaceDE/>
-        <w:autoSpaceDN/>
-        <w:bidi w:val="0"/>
-        <w:adjustRightInd/>
-        <w:snapToGrid/>
-        <w:spacing w:line="480" w:lineRule="auto"/>
-        <w:ind w:left="0" w:leftChars="0" w:firstLine="218" w:firstLineChars="91"/>
-        <w:jc w:val="left"/>
-        <w:textAlignment w:val="auto"/>
-        <w:rPr>
-          <w:rFonts w:hint="default" w:ascii="汉仪中宋简" w:hAnsi="汉仪中宋简" w:eastAsia="汉仪中宋简" w:cs="汉仪中宋简"/>
-          <w:snapToGrid/>
-          <w:kern w:val="2"/>
-          <w:sz w:val="24"/>
-          <w:szCs w:val="24"/>
-          <w:lang w:val="en-US" w:eastAsia="zh-CN"/>
-        </w:rPr>
-      </w:pPr>
-      <w:r>
-        <w:rPr>
-          <w:rFonts w:hint="eastAsia" w:ascii="汉仪中宋简" w:hAnsi="汉仪中宋简" w:eastAsia="汉仪中宋简" w:cs="汉仪中宋简"/>
-          <w:snapToGrid/>
-          <w:kern w:val="2"/>
-          <w:sz w:val="24"/>
-          <w:szCs w:val="24"/>
-          <w:lang w:val="en-US" w:eastAsia="zh-CN"/>
-        </w:rPr>
-        <w:t xml:space="preserve">B. </w:t>
-      </w:r>
-      <w:r>
-        <w:rPr>
-          <w:rFonts w:hint="default" w:ascii="汉仪中宋简" w:hAnsi="汉仪中宋简" w:eastAsia="汉仪中宋简" w:cs="汉仪中宋简"/>
-          <w:snapToGrid/>
-          <w:kern w:val="2"/>
-          <w:sz w:val="24"/>
-          <w:szCs w:val="24"/>
-          <w:lang w:val="en-US" w:eastAsia="zh-CN"/>
-        </w:rPr>
-        <w:t>简单询问过，大致了解</w:t>
-      </w:r>
-    </w:p>
-    <w:p ns2:paraId="2FEC6149">
-      <w:pPr>
-        <w:keepNext w:val="0"/>
-        <w:keepLines w:val="0"/>
-        <w:pageBreakBefore w:val="0"/>
-        <w:widowControl w:val="0"/>
-        <w:numPr>
-          <w:ilvl w:val="0"/>
-          <w:numId w:val="0"/>
-        </w:numPr>
-        <w:kinsoku/>
-        <w:wordWrap/>
-        <w:overflowPunct/>
-        <w:topLinePunct w:val="0"/>
-        <w:autoSpaceDE/>
-        <w:autoSpaceDN/>
-        <w:bidi w:val="0"/>
-        <w:adjustRightInd/>
-        <w:snapToGrid/>
-        <w:spacing w:line="480" w:lineRule="auto"/>
-        <w:ind w:left="0" w:leftChars="0" w:firstLine="218" w:firstLineChars="91"/>
-        <w:jc w:val="left"/>
-        <w:textAlignment w:val="auto"/>
-        <w:rPr>
-          <w:rFonts w:hint="default" w:ascii="汉仪中宋简" w:hAnsi="汉仪中宋简" w:eastAsia="汉仪中宋简" w:cs="汉仪中宋简"/>
-          <w:snapToGrid/>
-          <w:kern w:val="2"/>
-          <w:sz w:val="24"/>
-          <w:szCs w:val="24"/>
-          <w:lang w:val="en-US" w:eastAsia="zh-CN"/>
-        </w:rPr>
-      </w:pPr>
-      <w:r>
-        <w:rPr>
-          <w:rFonts w:hint="eastAsia" w:ascii="汉仪中宋简" w:hAnsi="汉仪中宋简" w:eastAsia="汉仪中宋简" w:cs="汉仪中宋简"/>
-          <w:snapToGrid/>
-          <w:kern w:val="2"/>
-          <w:sz w:val="24"/>
-          <w:szCs w:val="24"/>
-          <w:lang w:val="en-US" w:eastAsia="zh-CN"/>
-        </w:rPr>
-        <w:t xml:space="preserve">C. </w:t>
-      </w:r>
-      <w:r>
-        <w:rPr>
-          <w:rFonts w:hint="default" w:ascii="汉仪中宋简" w:hAnsi="汉仪中宋简" w:eastAsia="汉仪中宋简" w:cs="汉仪中宋简"/>
-          <w:snapToGrid/>
-          <w:kern w:val="2"/>
-          <w:sz w:val="24"/>
-          <w:szCs w:val="24"/>
-          <w:lang w:val="en-US" w:eastAsia="zh-CN"/>
-        </w:rPr>
-        <w:t>没咨询过，但认为无问题</w:t>
-      </w:r>
-    </w:p>
-    <w:p ns2:paraId="6280C8A0">
-      <w:pPr>
-        <w:keepNext w:val="0"/>
-        <w:keepLines w:val="0"/>
-        <w:pageBreakBefore w:val="0"/>
-        <w:widowControl w:val="0"/>
-        <w:numPr>
-          <w:ilvl w:val="0"/>
-          <w:numId w:val="0"/>
-        </w:numPr>
-        <w:kinsoku/>
-        <w:wordWrap/>
-        <w:overflowPunct/>
-        <w:topLinePunct w:val="0"/>
-        <w:autoSpaceDE/>
-        <w:autoSpaceDN/>
-        <w:bidi w:val="0"/>
-        <w:adjustRightInd/>
-        <w:snapToGrid/>
-        <w:spacing w:line="480" w:lineRule="auto"/>
-        <w:ind w:left="0" w:leftChars="0" w:firstLine="218" w:firstLineChars="91"/>
-        <w:jc w:val="left"/>
-        <w:textAlignment w:val="auto"/>
-        <w:rPr>
-          <w:rFonts w:hint="default" w:ascii="汉仪中宋简" w:hAnsi="汉仪中宋简" w:eastAsia="汉仪中宋简" w:cs="汉仪中宋简"/>
-          <w:snapToGrid/>
-          <w:kern w:val="2"/>
-          <w:sz w:val="24"/>
-          <w:szCs w:val="24"/>
-          <w:lang w:val="en-US" w:eastAsia="zh-CN"/>
-        </w:rPr>
-      </w:pPr>
-      <w:r>
-        <w:rPr>
-          <w:rFonts w:hint="eastAsia" w:ascii="汉仪中宋简" w:hAnsi="汉仪中宋简" w:eastAsia="汉仪中宋简" w:cs="汉仪中宋简"/>
-          <w:snapToGrid/>
-          <w:kern w:val="2"/>
-          <w:sz w:val="24"/>
-          <w:szCs w:val="24"/>
-          <w:lang w:val="en-US" w:eastAsia="zh-CN"/>
-        </w:rPr>
-        <w:t xml:space="preserve">D. </w:t>
-      </w:r>
-      <w:r>
-        <w:rPr>
-          <w:rFonts w:hint="default" w:ascii="汉仪中宋简" w:hAnsi="汉仪中宋简" w:eastAsia="汉仪中宋简" w:cs="汉仪中宋简"/>
-          <w:snapToGrid/>
-          <w:kern w:val="2"/>
-          <w:sz w:val="24"/>
-          <w:szCs w:val="24"/>
-          <w:lang w:val="en-US" w:eastAsia="zh-CN"/>
-        </w:rPr>
-        <w:t>没咨询过，不清楚是否有冲突</w:t>
-      </w:r>
-    </w:p>
-    <w:p ns2:paraId="761D9CEC">
-      <w:pPr>
-        <w:keepNext w:val="0"/>
-        <w:keepLines w:val="0"/>
-        <w:pageBreakBefore w:val="0"/>
-        <w:widowControl w:val="0"/>
-        <w:numPr>
-          <w:ilvl w:val="0"/>
-          <w:numId w:val="9"/>
-        </w:numPr>
-        <w:kinsoku/>
-        <w:wordWrap/>
-        <w:overflowPunct/>
-        <w:topLinePunct w:val="0"/>
-        <w:autoSpaceDE/>
-        <w:autoSpaceDN/>
-        <w:bidi w:val="0"/>
-        <w:adjustRightInd/>
-        <w:snapToGrid/>
-        <w:spacing w:line="480" w:lineRule="auto"/>
-        <w:ind w:left="425" w:leftChars="0" w:hanging="425" w:firstLineChars="0"/>
-        <w:jc w:val="left"/>
-        <w:textAlignment w:val="auto"/>
-        <w:rPr>
-          <w:rFonts w:hint="default" w:ascii="汉仪中宋简" w:hAnsi="汉仪中宋简" w:eastAsia="汉仪中宋简" w:cs="汉仪中宋简"/>
-          <w:snapToGrid/>
-          <w:kern w:val="2"/>
-          <w:sz w:val="24"/>
-          <w:szCs w:val="24"/>
-          <w:lang w:val="en-US" w:eastAsia="zh-CN"/>
-        </w:rPr>
-      </w:pPr>
-      <w:r>
-        <w:rPr>
-          <w:rFonts w:hint="default" w:ascii="汉仪中宋简" w:hAnsi="汉仪中宋简" w:eastAsia="汉仪中宋简" w:cs="汉仪中宋简"/>
-          <w:snapToGrid/>
-          <w:kern w:val="2"/>
-          <w:sz w:val="24"/>
-          <w:szCs w:val="24"/>
-          <w:lang w:val="en-US" w:eastAsia="zh-CN"/>
-        </w:rPr>
-        <w:t>您所在地区的厄贝沙坦氢氯噻嗪片供应是否稳定？</w:t>
-      </w:r>
-    </w:p>
-    <w:p ns2:paraId="285FB246">
-      <w:pPr>
-        <w:keepNext w:val="0"/>
-        <w:keepLines w:val="0"/>
-        <w:pageBreakBefore w:val="0"/>
-        <w:widowControl w:val="0"/>
-        <w:numPr>
-          <w:ilvl w:val="0"/>
-          <w:numId w:val="0"/>
-        </w:numPr>
-        <w:kinsoku/>
-        <w:wordWrap/>
-        <w:overflowPunct/>
-        <w:topLinePunct w:val="0"/>
-        <w:autoSpaceDE/>
-        <w:autoSpaceDN/>
-        <w:bidi w:val="0"/>
-        <w:adjustRightInd/>
-        <w:snapToGrid/>
-        <w:spacing w:line="480" w:lineRule="auto"/>
-        <w:ind w:left="0" w:leftChars="0" w:firstLine="218" w:firstLineChars="91"/>
-        <w:jc w:val="left"/>
-        <w:textAlignment w:val="auto"/>
-        <w:rPr>
-          <w:rFonts w:hint="default" w:ascii="汉仪中宋简" w:hAnsi="汉仪中宋简" w:eastAsia="汉仪中宋简" w:cs="汉仪中宋简"/>
-          <w:snapToGrid/>
-          <w:kern w:val="2"/>
-          <w:sz w:val="24"/>
-          <w:szCs w:val="24"/>
-          <w:lang w:val="en-US" w:eastAsia="zh-CN"/>
-        </w:rPr>
-      </w:pPr>
-      <w:r>
-        <w:rPr>
-          <w:rFonts w:hint="eastAsia" w:ascii="汉仪中宋简" w:hAnsi="汉仪中宋简" w:eastAsia="汉仪中宋简" w:cs="汉仪中宋简"/>
-          <w:snapToGrid/>
-          <w:kern w:val="2"/>
-          <w:sz w:val="24"/>
-          <w:szCs w:val="24"/>
-          <w:lang w:val="en-US" w:eastAsia="zh-CN"/>
-        </w:rPr>
-        <w:t xml:space="preserve">A. </w:t>
-      </w:r>
-      <w:r>
-        <w:rPr>
-          <w:rFonts w:hint="default" w:ascii="汉仪中宋简" w:hAnsi="汉仪中宋简" w:eastAsia="汉仪中宋简" w:cs="汉仪中宋简"/>
-          <w:snapToGrid/>
-          <w:kern w:val="2"/>
-          <w:sz w:val="24"/>
-          <w:szCs w:val="24"/>
-          <w:lang w:val="en-US" w:eastAsia="zh-CN"/>
-        </w:rPr>
-        <w:t>随时能买到</w:t>
-      </w:r>
-    </w:p>
-    <w:p ns2:paraId="5D6C5B9E">
-      <w:pPr>
-        <w:keepNext w:val="0"/>
-        <w:keepLines w:val="0"/>
-        <w:pageBreakBefore w:val="0"/>
-        <w:widowControl w:val="0"/>
-        <w:numPr>
-          <w:ilvl w:val="0"/>
-          <w:numId w:val="0"/>
-        </w:numPr>
-        <w:kinsoku/>
-        <w:wordWrap/>
-        <w:overflowPunct/>
-        <w:topLinePunct w:val="0"/>
-        <w:autoSpaceDE/>
-        <w:autoSpaceDN/>
-        <w:bidi w:val="0"/>
-        <w:adjustRightInd/>
-        <w:snapToGrid/>
-        <w:spacing w:line="480" w:lineRule="auto"/>
-        <w:ind w:left="0" w:leftChars="0" w:firstLine="218" w:firstLineChars="91"/>
-        <w:jc w:val="left"/>
-        <w:textAlignment w:val="auto"/>
-        <w:rPr>
-          <w:rFonts w:hint="default" w:ascii="汉仪中宋简" w:hAnsi="汉仪中宋简" w:eastAsia="汉仪中宋简" w:cs="汉仪中宋简"/>
-          <w:snapToGrid/>
-          <w:kern w:val="2"/>
-          <w:sz w:val="24"/>
-          <w:szCs w:val="24"/>
-          <w:lang w:val="en-US" w:eastAsia="zh-CN"/>
-        </w:rPr>
-      </w:pPr>
-      <w:r>
-        <w:rPr>
-          <w:rFonts w:hint="eastAsia" w:ascii="汉仪中宋简" w:hAnsi="汉仪中宋简" w:eastAsia="汉仪中宋简" w:cs="汉仪中宋简"/>
-          <w:snapToGrid/>
-          <w:kern w:val="2"/>
-          <w:sz w:val="24"/>
-          <w:szCs w:val="24"/>
-          <w:lang w:val="en-US" w:eastAsia="zh-CN"/>
-        </w:rPr>
-        <w:t xml:space="preserve">B. </w:t>
-      </w:r>
-      <w:r>
-        <w:rPr>
-          <w:rFonts w:hint="default" w:ascii="汉仪中宋简" w:hAnsi="汉仪中宋简" w:eastAsia="汉仪中宋简" w:cs="汉仪中宋简"/>
-          <w:snapToGrid/>
-          <w:kern w:val="2"/>
-          <w:sz w:val="24"/>
-          <w:szCs w:val="24"/>
-          <w:lang w:val="en-US" w:eastAsia="zh-CN"/>
-        </w:rPr>
-        <w:t>偶尔缺货但不影响用药</w:t>
-      </w:r>
-    </w:p>
-    <w:p ns2:paraId="33820A1F">
-      <w:pPr>
-        <w:keepNext w:val="0"/>
-        <w:keepLines w:val="0"/>
-        <w:pageBreakBefore w:val="0"/>
-        <w:widowControl w:val="0"/>
-        <w:numPr>
-          <w:ilvl w:val="0"/>
-          <w:numId w:val="0"/>
-        </w:numPr>
-        <w:kinsoku/>
-        <w:wordWrap/>
-        <w:overflowPunct/>
-        <w:topLinePunct w:val="0"/>
-        <w:autoSpaceDE/>
-        <w:autoSpaceDN/>
-        <w:bidi w:val="0"/>
-        <w:adjustRightInd/>
-        <w:snapToGrid/>
-        <w:spacing w:line="480" w:lineRule="auto"/>
-        <w:ind w:left="0" w:leftChars="0" w:firstLine="218" w:firstLineChars="91"/>
-        <w:jc w:val="left"/>
-        <w:textAlignment w:val="auto"/>
-        <w:rPr>
-          <w:rFonts w:hint="default" w:ascii="汉仪中宋简" w:hAnsi="汉仪中宋简" w:eastAsia="汉仪中宋简" w:cs="汉仪中宋简"/>
-          <w:snapToGrid/>
-          <w:kern w:val="2"/>
-          <w:sz w:val="24"/>
-          <w:szCs w:val="24"/>
-          <w:lang w:val="en-US" w:eastAsia="zh-CN"/>
-        </w:rPr>
-      </w:pPr>
-      <w:r>
-        <w:rPr>
-          <w:rFonts w:hint="eastAsia" w:ascii="汉仪中宋简" w:hAnsi="汉仪中宋简" w:eastAsia="汉仪中宋简" w:cs="汉仪中宋简"/>
-          <w:snapToGrid/>
-          <w:kern w:val="2"/>
-          <w:sz w:val="24"/>
-          <w:szCs w:val="24"/>
-          <w:lang w:val="en-US" w:eastAsia="zh-CN"/>
-        </w:rPr>
-        <w:t xml:space="preserve">C. </w:t>
-      </w:r>
-      <w:r>
-        <w:rPr>
-          <w:rFonts w:hint="default" w:ascii="汉仪中宋简" w:hAnsi="汉仪中宋简" w:eastAsia="汉仪中宋简" w:cs="汉仪中宋简"/>
-          <w:snapToGrid/>
-          <w:kern w:val="2"/>
-          <w:sz w:val="24"/>
-          <w:szCs w:val="24"/>
-          <w:lang w:val="en-US" w:eastAsia="zh-CN"/>
-        </w:rPr>
-        <w:t>经常缺货</w:t>
-      </w:r>
-    </w:p>
-    <w:p ns2:paraId="7C7F41D9">
-      <w:pPr>
-        <w:keepNext w:val="0"/>
-        <w:keepLines w:val="0"/>
-        <w:pageBreakBefore w:val="0"/>
-        <w:widowControl w:val="0"/>
-        <w:numPr>
-          <w:ilvl w:val="0"/>
-          <w:numId w:val="0"/>
-        </w:numPr>
-        <w:kinsoku/>
-        <w:wordWrap/>
-        <w:overflowPunct/>
-        <w:topLinePunct w:val="0"/>
-        <w:autoSpaceDE/>
-        <w:autoSpaceDN/>
-        <w:bidi w:val="0"/>
-        <w:adjustRightInd/>
-        <w:snapToGrid/>
-        <w:spacing w:line="480" w:lineRule="auto"/>
-        <w:ind w:left="0" w:leftChars="0" w:firstLine="218" w:firstLineChars="91"/>
-        <w:jc w:val="left"/>
-        <w:textAlignment w:val="auto"/>
-        <w:rPr>
-          <w:rFonts w:hint="eastAsia" w:ascii="汉仪中宋简" w:hAnsi="汉仪中宋简" w:eastAsia="汉仪中宋简" w:cs="汉仪中宋简"/>
-          <w:snapToGrid/>
-          <w:kern w:val="2"/>
-          <w:sz w:val="24"/>
-          <w:szCs w:val="24"/>
-          <w:lang w:val="en-US" w:eastAsia="zh-CN"/>
-        </w:rPr>
-      </w:pPr>
-      <w:r>
-        <w:rPr>
-          <w:rFonts w:hint="eastAsia" w:ascii="汉仪中宋简" w:hAnsi="汉仪中宋简" w:eastAsia="汉仪中宋简" w:cs="汉仪中宋简"/>
-          <w:snapToGrid/>
-          <w:kern w:val="2"/>
-          <w:sz w:val="24"/>
-          <w:szCs w:val="24"/>
-          <w:lang w:val="en-US" w:eastAsia="zh-CN"/>
-        </w:rPr>
-        <w:t xml:space="preserve">D. </w:t>
-      </w:r>
-      <w:r>
-        <w:rPr>
-          <w:rFonts w:hint="default" w:ascii="汉仪中宋简" w:hAnsi="汉仪中宋简" w:eastAsia="汉仪中宋简" w:cs="汉仪中宋简"/>
-          <w:snapToGrid/>
-          <w:kern w:val="2"/>
-          <w:sz w:val="24"/>
-          <w:szCs w:val="24"/>
-          <w:lang w:val="en-US" w:eastAsia="zh-CN"/>
-        </w:rPr>
-        <w:t>严重影响用药</w:t>
-      </w:r>
-    </w:p>
-    <w:p ns2:paraId="429D0FCE">
-      <w:pPr>
-        <w:keepNext w:val="0"/>
-        <w:keepLines w:val="0"/>
-        <w:pageBreakBefore w:val="0"/>
-        <w:widowControl w:val="0"/>
-        <w:numPr>
-          <w:ilvl w:val="0"/>
-          <w:numId w:val="9"/>
-        </w:numPr>
-        <w:kinsoku/>
-        <w:wordWrap/>
-        <w:overflowPunct/>
-        <w:topLinePunct w:val="0"/>
-        <w:autoSpaceDE/>
-        <w:autoSpaceDN/>
-        <w:bidi w:val="0"/>
-        <w:adjustRightInd/>
-        <w:snapToGrid/>
-        <w:spacing w:line="480" w:lineRule="auto"/>
-        <w:ind w:left="425" w:leftChars="0" w:hanging="425" w:firstLineChars="0"/>
-        <w:jc w:val="left"/>
-        <w:textAlignment w:val="auto"/>
-        <w:rPr>
-          <w:rFonts w:hint="default" w:ascii="汉仪中宋简" w:hAnsi="汉仪中宋简" w:eastAsia="汉仪中宋简" w:cs="汉仪中宋简"/>
-          <w:snapToGrid/>
-          <w:kern w:val="2"/>
-          <w:sz w:val="24"/>
-          <w:szCs w:val="24"/>
-          <w:lang w:val="en-US" w:eastAsia="zh-CN"/>
-        </w:rPr>
-      </w:pPr>
-      <w:r>
-        <w:rPr>
-          <w:rFonts w:hint="default" w:ascii="汉仪中宋简" w:hAnsi="汉仪中宋简" w:eastAsia="汉仪中宋简" w:cs="汉仪中宋简"/>
-          <w:snapToGrid/>
-          <w:kern w:val="2"/>
-          <w:sz w:val="24"/>
-          <w:szCs w:val="24"/>
-          <w:lang w:val="en-US" w:eastAsia="zh-CN"/>
-        </w:rPr>
-        <w:t>您服用厄贝沙坦氢氯噻嗪片期间，是否定期监测血压？</w:t>
-      </w:r>
-    </w:p>
-    <w:p ns2:paraId="0092B7AB">
-      <w:pPr>
-        <w:keepNext w:val="0"/>
-        <w:keepLines w:val="0"/>
-        <w:pageBreakBefore w:val="0"/>
-        <w:widowControl w:val="0"/>
-        <w:numPr>
-          <w:ilvl w:val="0"/>
-          <w:numId w:val="0"/>
-        </w:numPr>
-        <w:kinsoku/>
-        <w:wordWrap/>
-        <w:overflowPunct/>
-        <w:topLinePunct w:val="0"/>
-        <w:autoSpaceDE/>
-        <w:autoSpaceDN/>
-        <w:bidi w:val="0"/>
-        <w:adjustRightInd/>
-        <w:snapToGrid/>
-        <w:spacing w:line="480" w:lineRule="auto"/>
-        <w:ind w:left="0" w:leftChars="0" w:firstLine="218" w:firstLineChars="91"/>
-        <w:jc w:val="left"/>
-        <w:textAlignment w:val="auto"/>
-        <w:rPr>
-          <w:rFonts w:hint="default" w:ascii="汉仪中宋简" w:hAnsi="汉仪中宋简" w:eastAsia="汉仪中宋简" w:cs="汉仪中宋简"/>
-          <w:snapToGrid/>
-          <w:kern w:val="2"/>
-          <w:sz w:val="24"/>
-          <w:szCs w:val="24"/>
-          <w:lang w:val="en-US" w:eastAsia="zh-CN"/>
-        </w:rPr>
-      </w:pPr>
-      <w:r>
-        <w:rPr>
-          <w:rFonts w:hint="eastAsia" w:ascii="汉仪中宋简" w:hAnsi="汉仪中宋简" w:eastAsia="汉仪中宋简" w:cs="汉仪中宋简"/>
-          <w:snapToGrid/>
-          <w:kern w:val="2"/>
-          <w:sz w:val="24"/>
-          <w:szCs w:val="24"/>
-          <w:lang w:val="en-US" w:eastAsia="zh-CN"/>
-        </w:rPr>
-        <w:t xml:space="preserve">A. </w:t>
-      </w:r>
-      <w:r>
-        <w:rPr>
-          <w:rFonts w:hint="default" w:ascii="汉仪中宋简" w:hAnsi="汉仪中宋简" w:eastAsia="汉仪中宋简" w:cs="汉仪中宋简"/>
-          <w:snapToGrid/>
-          <w:kern w:val="2"/>
-          <w:sz w:val="24"/>
-          <w:szCs w:val="24"/>
-          <w:lang w:val="en-US" w:eastAsia="zh-CN"/>
-        </w:rPr>
-        <w:t>每天监测，记录详细数据</w:t>
-      </w:r>
-    </w:p>
-    <w:p ns2:paraId="290FDC11">
-      <w:pPr>
-        <w:keepNext w:val="0"/>
-        <w:keepLines w:val="0"/>
-        <w:pageBreakBefore w:val="0"/>
-        <w:widowControl w:val="0"/>
-        <w:numPr>
-          <w:ilvl w:val="0"/>
-          <w:numId w:val="0"/>
-        </w:numPr>
-        <w:kinsoku/>
-        <w:wordWrap/>
-        <w:overflowPunct/>
-        <w:topLinePunct w:val="0"/>
-        <w:autoSpaceDE/>
-        <w:autoSpaceDN/>
-        <w:bidi w:val="0"/>
-        <w:adjustRightInd/>
-        <w:snapToGrid/>
-        <w:spacing w:line="480" w:lineRule="auto"/>
-        <w:ind w:left="0" w:leftChars="0" w:firstLine="218" w:firstLineChars="91"/>
-        <w:jc w:val="left"/>
-        <w:textAlignment w:val="auto"/>
-        <w:rPr>
-          <w:rFonts w:hint="default" w:ascii="汉仪中宋简" w:hAnsi="汉仪中宋简" w:eastAsia="汉仪中宋简" w:cs="汉仪中宋简"/>
-          <w:snapToGrid/>
-          <w:kern w:val="2"/>
-          <w:sz w:val="24"/>
-          <w:szCs w:val="24"/>
-          <w:lang w:val="en-US" w:eastAsia="zh-CN"/>
-        </w:rPr>
-      </w:pPr>
-      <w:r>
-        <w:rPr>
-          <w:rFonts w:hint="eastAsia" w:ascii="汉仪中宋简" w:hAnsi="汉仪中宋简" w:eastAsia="汉仪中宋简" w:cs="汉仪中宋简"/>
-          <w:snapToGrid/>
-          <w:kern w:val="2"/>
-          <w:sz w:val="24"/>
-          <w:szCs w:val="24"/>
-          <w:lang w:val="en-US" w:eastAsia="zh-CN"/>
-        </w:rPr>
-        <w:t xml:space="preserve">B. </w:t>
-      </w:r>
-      <w:r>
-        <w:rPr>
-          <w:rFonts w:hint="default" w:ascii="汉仪中宋简" w:hAnsi="汉仪中宋简" w:eastAsia="汉仪中宋简" w:cs="汉仪中宋简"/>
-          <w:snapToGrid/>
-          <w:kern w:val="2"/>
-          <w:sz w:val="24"/>
-          <w:szCs w:val="24"/>
-          <w:lang w:val="en-US" w:eastAsia="zh-CN"/>
-        </w:rPr>
-        <w:t>每周监测 2-3 次，了解大致情况</w:t>
-      </w:r>
-    </w:p>
-    <w:p ns2:paraId="772CAEC4">
-      <w:pPr>
-        <w:keepNext w:val="0"/>
-        <w:keepLines w:val="0"/>
-        <w:pageBreakBefore w:val="0"/>
-        <w:widowControl w:val="0"/>
-        <w:numPr>
-          <w:ilvl w:val="0"/>
-          <w:numId w:val="0"/>
-        </w:numPr>
-        <w:kinsoku/>
-        <w:wordWrap/>
-        <w:overflowPunct/>
-        <w:topLinePunct w:val="0"/>
-        <w:autoSpaceDE/>
-        <w:autoSpaceDN/>
-        <w:bidi w:val="0"/>
-        <w:adjustRightInd/>
-        <w:snapToGrid/>
-        <w:spacing w:line="480" w:lineRule="auto"/>
-        <w:ind w:left="0" w:leftChars="0" w:firstLine="218" w:firstLineChars="91"/>
-        <w:jc w:val="left"/>
-        <w:textAlignment w:val="auto"/>
-        <w:rPr>
-          <w:rFonts w:hint="default" w:ascii="汉仪中宋简" w:hAnsi="汉仪中宋简" w:eastAsia="汉仪中宋简" w:cs="汉仪中宋简"/>
-          <w:snapToGrid/>
-          <w:kern w:val="2"/>
-          <w:sz w:val="24"/>
-          <w:szCs w:val="24"/>
-          <w:lang w:val="en-US" w:eastAsia="zh-CN"/>
-        </w:rPr>
-      </w:pPr>
-      <w:r>
-        <w:rPr>
-          <w:rFonts w:hint="eastAsia" w:ascii="汉仪中宋简" w:hAnsi="汉仪中宋简" w:eastAsia="汉仪中宋简" w:cs="汉仪中宋简"/>
-          <w:snapToGrid/>
-          <w:kern w:val="2"/>
-          <w:sz w:val="24"/>
-          <w:szCs w:val="24"/>
-          <w:lang w:val="en-US" w:eastAsia="zh-CN"/>
-        </w:rPr>
-        <w:t xml:space="preserve">C. </w:t>
-      </w:r>
-      <w:r>
-        <w:rPr>
-          <w:rFonts w:hint="default" w:ascii="汉仪中宋简" w:hAnsi="汉仪中宋简" w:eastAsia="汉仪中宋简" w:cs="汉仪中宋简"/>
-          <w:snapToGrid/>
-          <w:kern w:val="2"/>
-          <w:sz w:val="24"/>
-          <w:szCs w:val="24"/>
-          <w:lang w:val="en-US" w:eastAsia="zh-CN"/>
-        </w:rPr>
-        <w:t>偶尔监测，无固定频率</w:t>
-      </w:r>
-    </w:p>
-    <w:p ns2:paraId="095D4DE0">
-      <w:pPr>
-        <w:keepNext w:val="0"/>
-        <w:keepLines w:val="0"/>
-        <w:pageBreakBefore w:val="0"/>
-        <w:widowControl w:val="0"/>
-        <w:numPr>
-          <w:ilvl w:val="0"/>
-          <w:numId w:val="0"/>
-        </w:numPr>
-        <w:kinsoku/>
-        <w:wordWrap/>
-        <w:overflowPunct/>
-        <w:topLinePunct w:val="0"/>
-        <w:autoSpaceDE/>
-        <w:autoSpaceDN/>
-        <w:bidi w:val="0"/>
-        <w:adjustRightInd/>
-        <w:snapToGrid/>
-        <w:spacing w:line="480" w:lineRule="auto"/>
-        <w:ind w:left="0" w:leftChars="0" w:firstLine="218" w:firstLineChars="91"/>
-        <w:jc w:val="left"/>
-        <w:textAlignment w:val="auto"/>
-        <w:rPr>
-          <w:rFonts w:hint="default" w:ascii="汉仪中宋简" w:hAnsi="汉仪中宋简" w:eastAsia="汉仪中宋简" w:cs="汉仪中宋简"/>
-          <w:snapToGrid/>
-          <w:kern w:val="2"/>
-          <w:sz w:val="24"/>
-          <w:szCs w:val="24"/>
-          <w:lang w:val="en-US" w:eastAsia="zh-CN"/>
-        </w:rPr>
-      </w:pPr>
-      <w:r>
-        <w:rPr>
-          <w:rFonts w:hint="eastAsia" w:ascii="汉仪中宋简" w:hAnsi="汉仪中宋简" w:eastAsia="汉仪中宋简" w:cs="汉仪中宋简"/>
-          <w:snapToGrid/>
-          <w:kern w:val="2"/>
-          <w:sz w:val="24"/>
-          <w:szCs w:val="24"/>
-          <w:lang w:val="en-US" w:eastAsia="zh-CN"/>
-        </w:rPr>
-        <w:t xml:space="preserve">D. </w:t>
-      </w:r>
-      <w:r>
-        <w:rPr>
-          <w:rFonts w:hint="default" w:ascii="汉仪中宋简" w:hAnsi="汉仪中宋简" w:eastAsia="汉仪中宋简" w:cs="汉仪中宋简"/>
-          <w:snapToGrid/>
-          <w:kern w:val="2"/>
-          <w:sz w:val="24"/>
-          <w:szCs w:val="24"/>
-          <w:lang w:val="en-US" w:eastAsia="zh-CN"/>
-        </w:rPr>
-        <w:t>从未监测</w:t>
-      </w:r>
-    </w:p>
-    <w:p ns2:paraId="12C2374E">
-      <w:pPr>
-        <w:keepNext w:val="0"/>
-        <w:keepLines w:val="0"/>
-        <w:pageBreakBefore w:val="0"/>
-        <w:widowControl w:val="0"/>
-        <w:numPr>
-          <w:ilvl w:val="0"/>
-          <w:numId w:val="9"/>
-        </w:numPr>
-        <w:kinsoku/>
-        <w:wordWrap/>
-        <w:overflowPunct/>
-        <w:topLinePunct w:val="0"/>
-        <w:autoSpaceDE/>
-        <w:autoSpaceDN/>
-        <w:bidi w:val="0"/>
-        <w:adjustRightInd/>
-        <w:snapToGrid/>
-        <w:spacing w:line="480" w:lineRule="auto"/>
-        <w:ind w:left="425" w:leftChars="0" w:hanging="425" w:firstLineChars="0"/>
-        <w:jc w:val="left"/>
-        <w:textAlignment w:val="auto"/>
-        <w:rPr>
-          <w:rFonts w:hint="default" w:ascii="汉仪中宋简" w:hAnsi="汉仪中宋简" w:eastAsia="汉仪中宋简" w:cs="汉仪中宋简"/>
-          <w:snapToGrid/>
-          <w:kern w:val="2"/>
-          <w:sz w:val="24"/>
-          <w:szCs w:val="24"/>
-          <w:lang w:val="en-US" w:eastAsia="zh-CN"/>
-        </w:rPr>
-      </w:pPr>
-      <w:r>
-        <w:rPr>
-          <w:rFonts w:hint="default" w:ascii="汉仪中宋简" w:hAnsi="汉仪中宋简" w:eastAsia="汉仪中宋简" w:cs="汉仪中宋简"/>
-          <w:snapToGrid/>
-          <w:kern w:val="2"/>
-          <w:sz w:val="24"/>
-          <w:szCs w:val="24"/>
-          <w:lang w:val="en-US" w:eastAsia="zh-CN"/>
-        </w:rPr>
-        <w:t>您对厄贝沙坦氢氯噻嗪片药品包装的便利性评价如何？</w:t>
-      </w:r>
-    </w:p>
-    <w:p ns2:paraId="3B9158A8">
-      <w:pPr>
-        <w:keepNext w:val="0"/>
-        <w:keepLines w:val="0"/>
-        <w:pageBreakBefore w:val="0"/>
-        <w:widowControl w:val="0"/>
-        <w:numPr>
-          <w:ilvl w:val="0"/>
-          <w:numId w:val="0"/>
-        </w:numPr>
-        <w:kinsoku/>
-        <w:wordWrap/>
-        <w:overflowPunct/>
-        <w:topLinePunct w:val="0"/>
-        <w:autoSpaceDE/>
-        <w:autoSpaceDN/>
-        <w:bidi w:val="0"/>
-        <w:adjustRightInd/>
-        <w:snapToGrid/>
-        <w:spacing w:line="480" w:lineRule="auto"/>
-        <w:ind w:left="0" w:leftChars="0" w:firstLine="218" w:firstLineChars="91"/>
-        <w:jc w:val="left"/>
-        <w:textAlignment w:val="auto"/>
-        <w:rPr>
-          <w:rFonts w:hint="default" w:ascii="汉仪中宋简" w:hAnsi="汉仪中宋简" w:eastAsia="汉仪中宋简" w:cs="汉仪中宋简"/>
-          <w:snapToGrid/>
-          <w:kern w:val="2"/>
-          <w:sz w:val="24"/>
-          <w:szCs w:val="24"/>
-          <w:lang w:val="en-US" w:eastAsia="zh-CN"/>
-        </w:rPr>
-      </w:pPr>
-      <w:r>
-        <w:rPr>
-          <w:rFonts w:hint="eastAsia" w:ascii="汉仪中宋简" w:hAnsi="汉仪中宋简" w:eastAsia="汉仪中宋简" w:cs="汉仪中宋简"/>
-          <w:snapToGrid/>
-          <w:kern w:val="2"/>
-          <w:sz w:val="24"/>
-          <w:szCs w:val="24"/>
-          <w:lang w:val="en-US" w:eastAsia="zh-CN"/>
-        </w:rPr>
-        <w:t xml:space="preserve">A. </w:t>
-      </w:r>
-      <w:r>
-        <w:rPr>
-          <w:rFonts w:hint="default" w:ascii="汉仪中宋简" w:hAnsi="汉仪中宋简" w:eastAsia="汉仪中宋简" w:cs="汉仪中宋简"/>
-          <w:snapToGrid/>
-          <w:kern w:val="2"/>
-          <w:sz w:val="24"/>
-          <w:szCs w:val="24"/>
-          <w:lang w:val="en-US" w:eastAsia="zh-CN"/>
-        </w:rPr>
-        <w:t>储存、取用都方便</w:t>
-      </w:r>
-    </w:p>
-    <w:p ns2:paraId="61A7E73D">
-      <w:pPr>
-        <w:keepNext w:val="0"/>
-        <w:keepLines w:val="0"/>
-        <w:pageBreakBefore w:val="0"/>
-        <w:widowControl w:val="0"/>
-        <w:numPr>
-          <w:ilvl w:val="0"/>
-          <w:numId w:val="0"/>
-        </w:numPr>
-        <w:kinsoku/>
-        <w:wordWrap/>
-        <w:overflowPunct/>
-        <w:topLinePunct w:val="0"/>
-        <w:autoSpaceDE/>
-        <w:autoSpaceDN/>
-        <w:bidi w:val="0"/>
-        <w:adjustRightInd/>
-        <w:snapToGrid/>
-        <w:spacing w:line="480" w:lineRule="auto"/>
-        <w:ind w:left="0" w:leftChars="0" w:firstLine="218" w:firstLineChars="91"/>
-        <w:jc w:val="left"/>
-        <w:textAlignment w:val="auto"/>
-        <w:rPr>
-          <w:rFonts w:hint="default" w:ascii="汉仪中宋简" w:hAnsi="汉仪中宋简" w:eastAsia="汉仪中宋简" w:cs="汉仪中宋简"/>
-          <w:snapToGrid/>
-          <w:kern w:val="2"/>
-          <w:sz w:val="24"/>
-          <w:szCs w:val="24"/>
-          <w:lang w:val="en-US" w:eastAsia="zh-CN"/>
-        </w:rPr>
-      </w:pPr>
-      <w:r>
-        <w:rPr>
-          <w:rFonts w:hint="eastAsia" w:ascii="汉仪中宋简" w:hAnsi="汉仪中宋简" w:eastAsia="汉仪中宋简" w:cs="汉仪中宋简"/>
-          <w:snapToGrid/>
-          <w:kern w:val="2"/>
-          <w:sz w:val="24"/>
-          <w:szCs w:val="24"/>
-          <w:lang w:val="en-US" w:eastAsia="zh-CN"/>
-        </w:rPr>
-        <w:t xml:space="preserve">B. </w:t>
-      </w:r>
-      <w:r>
-        <w:rPr>
-          <w:rFonts w:hint="default" w:ascii="汉仪中宋简" w:hAnsi="汉仪中宋简" w:eastAsia="汉仪中宋简" w:cs="汉仪中宋简"/>
-          <w:snapToGrid/>
-          <w:kern w:val="2"/>
-          <w:sz w:val="24"/>
-          <w:szCs w:val="24"/>
-          <w:lang w:val="en-US" w:eastAsia="zh-CN"/>
-        </w:rPr>
-        <w:t>基本满足需求</w:t>
-      </w:r>
-    </w:p>
-    <w:p ns2:paraId="0234AF46">
-      <w:pPr>
-        <w:keepNext w:val="0"/>
-        <w:keepLines w:val="0"/>
-        <w:pageBreakBefore w:val="0"/>
-        <w:widowControl w:val="0"/>
-        <w:numPr>
-          <w:ilvl w:val="0"/>
-          <w:numId w:val="0"/>
-        </w:numPr>
-        <w:kinsoku/>
-        <w:wordWrap/>
-        <w:overflowPunct/>
-        <w:topLinePunct w:val="0"/>
-        <w:autoSpaceDE/>
-        <w:autoSpaceDN/>
-        <w:bidi w:val="0"/>
-        <w:adjustRightInd/>
-        <w:snapToGrid/>
-        <w:spacing w:line="480" w:lineRule="auto"/>
-        <w:ind w:left="0" w:leftChars="0" w:firstLine="218" w:firstLineChars="91"/>
-        <w:jc w:val="left"/>
-        <w:textAlignment w:val="auto"/>
-        <w:rPr>
-          <w:rFonts w:hint="default" w:ascii="汉仪中宋简" w:hAnsi="汉仪中宋简" w:eastAsia="汉仪中宋简" w:cs="汉仪中宋简"/>
-          <w:snapToGrid/>
-          <w:kern w:val="2"/>
-          <w:sz w:val="24"/>
-          <w:szCs w:val="24"/>
-          <w:lang w:val="en-US" w:eastAsia="zh-CN"/>
-        </w:rPr>
-      </w:pPr>
-      <w:r>
-        <w:rPr>
-          <w:rFonts w:hint="eastAsia" w:ascii="汉仪中宋简" w:hAnsi="汉仪中宋简" w:eastAsia="汉仪中宋简" w:cs="汉仪中宋简"/>
-          <w:snapToGrid/>
-          <w:kern w:val="2"/>
-          <w:sz w:val="24"/>
-          <w:szCs w:val="24"/>
-          <w:lang w:val="en-US" w:eastAsia="zh-CN"/>
-        </w:rPr>
-        <w:t xml:space="preserve">C. </w:t>
-      </w:r>
-      <w:r>
-        <w:rPr>
-          <w:rFonts w:hint="default" w:ascii="汉仪中宋简" w:hAnsi="汉仪中宋简" w:eastAsia="汉仪中宋简" w:cs="汉仪中宋简"/>
-          <w:snapToGrid/>
-          <w:kern w:val="2"/>
-          <w:sz w:val="24"/>
-          <w:szCs w:val="24"/>
-          <w:lang w:val="en-US" w:eastAsia="zh-CN"/>
-        </w:rPr>
-        <w:t>存在取用麻烦等问题</w:t>
-      </w:r>
-    </w:p>
-    <w:p ns2:paraId="63775ECB">
-      <w:pPr>
-        <w:keepNext w:val="0"/>
-        <w:keepLines w:val="0"/>
-        <w:pageBreakBefore w:val="0"/>
-        <w:widowControl w:val="0"/>
-        <w:numPr>
-          <w:ilvl w:val="0"/>
-          <w:numId w:val="0"/>
-        </w:numPr>
-        <w:kinsoku/>
-        <w:wordWrap/>
-        <w:overflowPunct/>
-        <w:topLinePunct w:val="0"/>
-        <w:autoSpaceDE/>
-        <w:autoSpaceDN/>
-        <w:bidi w:val="0"/>
-        <w:adjustRightInd/>
-        <w:snapToGrid/>
-        <w:spacing w:line="480" w:lineRule="auto"/>
-        <w:ind w:left="0" w:leftChars="0" w:firstLine="218" w:firstLineChars="91"/>
-        <w:jc w:val="left"/>
-        <w:textAlignment w:val="auto"/>
-        <w:rPr>
-          <w:rFonts w:hint="default" w:ascii="汉仪中宋简" w:hAnsi="汉仪中宋简" w:eastAsia="汉仪中宋简" w:cs="汉仪中宋简"/>
-          <w:snapToGrid/>
-          <w:kern w:val="2"/>
-          <w:sz w:val="24"/>
-          <w:szCs w:val="24"/>
-          <w:lang w:val="en-US" w:eastAsia="zh-CN"/>
-        </w:rPr>
-      </w:pPr>
-      <w:r>
-        <w:rPr>
-          <w:rFonts w:hint="eastAsia" w:ascii="汉仪中宋简" w:hAnsi="汉仪中宋简" w:eastAsia="汉仪中宋简" w:cs="汉仪中宋简"/>
-          <w:snapToGrid/>
-          <w:kern w:val="2"/>
-          <w:sz w:val="24"/>
-          <w:szCs w:val="24"/>
-          <w:lang w:val="en-US" w:eastAsia="zh-CN"/>
-        </w:rPr>
-        <w:t xml:space="preserve">D. </w:t>
-      </w:r>
-      <w:r>
-        <w:rPr>
-          <w:rFonts w:hint="default" w:ascii="汉仪中宋简" w:hAnsi="汉仪中宋简" w:eastAsia="汉仪中宋简" w:cs="汉仪中宋简"/>
-          <w:snapToGrid/>
-          <w:kern w:val="2"/>
-          <w:sz w:val="24"/>
-          <w:szCs w:val="24"/>
-          <w:lang w:val="en-US" w:eastAsia="zh-CN"/>
-        </w:rPr>
-        <w:t>非常不便利，严重影响使用</w:t>
-      </w:r>
-    </w:p>
-    <w:p ns2:paraId="7C23499B">
-      <w:pPr>
-        <w:keepNext w:val="0"/>
-        <w:keepLines w:val="0"/>
-        <w:pageBreakBefore w:val="0"/>
-        <w:widowControl w:val="0"/>
-        <w:numPr>
-          <w:ilvl w:val="0"/>
-          <w:numId w:val="9"/>
-        </w:numPr>
-        <w:kinsoku/>
-        <w:wordWrap/>
-        <w:overflowPunct/>
-        <w:topLinePunct w:val="0"/>
-        <w:autoSpaceDE/>
-        <w:autoSpaceDN/>
-        <w:bidi w:val="0"/>
-        <w:adjustRightInd/>
-        <w:snapToGrid/>
-        <w:spacing w:line="480" w:lineRule="auto"/>
-        <w:ind w:left="425" w:leftChars="0" w:hanging="425" w:firstLineChars="0"/>
-        <w:jc w:val="left"/>
-        <w:textAlignment w:val="auto"/>
-        <w:rPr>
-          <w:rFonts w:hint="default" w:ascii="汉仪中宋简" w:hAnsi="汉仪中宋简" w:eastAsia="汉仪中宋简" w:cs="汉仪中宋简"/>
-          <w:snapToGrid/>
-          <w:kern w:val="2"/>
-          <w:sz w:val="24"/>
-          <w:szCs w:val="24"/>
-          <w:lang w:val="en-US" w:eastAsia="zh-CN"/>
-        </w:rPr>
-      </w:pPr>
-      <w:r>
-        <w:rPr>
-          <w:rFonts w:hint="default" w:ascii="汉仪中宋简" w:hAnsi="汉仪中宋简" w:eastAsia="汉仪中宋简" w:cs="汉仪中宋简"/>
-          <w:snapToGrid/>
-          <w:kern w:val="2"/>
-          <w:sz w:val="24"/>
-          <w:szCs w:val="24"/>
-          <w:lang w:val="en-US" w:eastAsia="zh-CN"/>
-        </w:rPr>
-        <w:t>您对厄贝沙坦氢氯噻嗪片说明书中</w:t>
-      </w:r>
-      <w:r>
-        <w:rPr>
-          <w:rFonts w:hint="eastAsia" w:ascii="汉仪中宋简" w:hAnsi="汉仪中宋简" w:eastAsia="汉仪中宋简" w:cs="汉仪中宋简"/>
-          <w:snapToGrid/>
-          <w:kern w:val="2"/>
-          <w:sz w:val="24"/>
-          <w:szCs w:val="24"/>
-          <w:lang w:val="en-US" w:eastAsia="zh-CN"/>
-        </w:rPr>
-        <w:t>“</w:t>
-      </w:r>
-      <w:r>
-        <w:rPr>
-          <w:rFonts w:hint="default" w:ascii="汉仪中宋简" w:hAnsi="汉仪中宋简" w:eastAsia="汉仪中宋简" w:cs="汉仪中宋简"/>
-          <w:snapToGrid/>
-          <w:kern w:val="2"/>
-          <w:sz w:val="24"/>
-          <w:szCs w:val="24"/>
-          <w:lang w:val="en-US" w:eastAsia="zh-CN"/>
-        </w:rPr>
-        <w:t>用法用量”“不良反应</w:t>
-      </w:r>
-      <w:r>
-        <w:rPr>
-          <w:rFonts w:hint="eastAsia" w:ascii="汉仪中宋简" w:hAnsi="汉仪中宋简" w:eastAsia="汉仪中宋简" w:cs="汉仪中宋简"/>
-          <w:snapToGrid/>
-          <w:kern w:val="2"/>
-          <w:sz w:val="24"/>
-          <w:szCs w:val="24"/>
-          <w:lang w:val="en-US" w:eastAsia="zh-CN"/>
-        </w:rPr>
-        <w:t>”</w:t>
-      </w:r>
-      <w:r>
-        <w:rPr>
-          <w:rFonts w:hint="default" w:ascii="汉仪中宋简" w:hAnsi="汉仪中宋简" w:eastAsia="汉仪中宋简" w:cs="汉仪中宋简"/>
-          <w:snapToGrid/>
-          <w:kern w:val="2"/>
-          <w:sz w:val="24"/>
-          <w:szCs w:val="24"/>
-          <w:lang w:val="en-US" w:eastAsia="zh-CN"/>
-        </w:rPr>
-        <w:t>的标注清晰度评价如何？</w:t>
-      </w:r>
-    </w:p>
-    <w:p ns2:paraId="4EE70D2B">
-      <w:pPr>
-        <w:keepNext w:val="0"/>
-        <w:keepLines w:val="0"/>
-        <w:pageBreakBefore w:val="0"/>
-        <w:widowControl w:val="0"/>
-        <w:numPr>
-          <w:ilvl w:val="0"/>
-          <w:numId w:val="0"/>
-        </w:numPr>
-        <w:kinsoku/>
-        <w:wordWrap/>
-        <w:overflowPunct/>
-        <w:topLinePunct w:val="0"/>
-        <w:autoSpaceDE/>
-        <w:autoSpaceDN/>
-        <w:bidi w:val="0"/>
-        <w:adjustRightInd/>
-        <w:snapToGrid/>
-        <w:spacing w:line="480" w:lineRule="auto"/>
-        <w:ind w:left="0" w:leftChars="0" w:firstLine="218" w:firstLineChars="91"/>
-        <w:jc w:val="left"/>
-        <w:textAlignment w:val="auto"/>
-        <w:rPr>
-          <w:rFonts w:hint="default" w:ascii="汉仪中宋简" w:hAnsi="汉仪中宋简" w:eastAsia="汉仪中宋简" w:cs="汉仪中宋简"/>
-          <w:snapToGrid/>
-          <w:kern w:val="2"/>
-          <w:sz w:val="24"/>
-          <w:szCs w:val="24"/>
-          <w:lang w:val="en-US" w:eastAsia="zh-CN"/>
-        </w:rPr>
-      </w:pPr>
-      <w:r>
-        <w:rPr>
-          <w:rFonts w:hint="eastAsia" w:ascii="汉仪中宋简" w:hAnsi="汉仪中宋简" w:eastAsia="汉仪中宋简" w:cs="汉仪中宋简"/>
-          <w:snapToGrid/>
-          <w:kern w:val="2"/>
-          <w:sz w:val="24"/>
-          <w:szCs w:val="24"/>
-          <w:lang w:val="en-US" w:eastAsia="zh-CN"/>
-        </w:rPr>
-        <w:t xml:space="preserve">A. </w:t>
-      </w:r>
-      <w:r>
-        <w:rPr>
-          <w:rFonts w:hint="default" w:ascii="汉仪中宋简" w:hAnsi="汉仪中宋简" w:eastAsia="汉仪中宋简" w:cs="汉仪中宋简"/>
-          <w:snapToGrid/>
-          <w:kern w:val="2"/>
-          <w:sz w:val="24"/>
-          <w:szCs w:val="24"/>
-          <w:lang w:val="en-US" w:eastAsia="zh-CN"/>
-        </w:rPr>
-        <w:t>一目了然</w:t>
-      </w:r>
-    </w:p>
-    <w:p ns2:paraId="2D376978">
-      <w:pPr>
-        <w:keepNext w:val="0"/>
-        <w:keepLines w:val="0"/>
-        <w:pageBreakBefore w:val="0"/>
-        <w:widowControl w:val="0"/>
-        <w:numPr>
-          <w:ilvl w:val="0"/>
-          <w:numId w:val="0"/>
-        </w:numPr>
-        <w:kinsoku/>
-        <w:wordWrap/>
-        <w:overflowPunct/>
-        <w:topLinePunct w:val="0"/>
-        <w:autoSpaceDE/>
-        <w:autoSpaceDN/>
-        <w:bidi w:val="0"/>
-        <w:adjustRightInd/>
-        <w:snapToGrid/>
-        <w:spacing w:line="480" w:lineRule="auto"/>
-        <w:ind w:left="0" w:leftChars="0" w:firstLine="218" w:firstLineChars="91"/>
-        <w:jc w:val="left"/>
-        <w:textAlignment w:val="auto"/>
-        <w:rPr>
-          <w:rFonts w:hint="default" w:ascii="汉仪中宋简" w:hAnsi="汉仪中宋简" w:eastAsia="汉仪中宋简" w:cs="汉仪中宋简"/>
-          <w:snapToGrid/>
-          <w:kern w:val="2"/>
-          <w:sz w:val="24"/>
-          <w:szCs w:val="24"/>
-          <w:lang w:val="en-US" w:eastAsia="zh-CN"/>
-        </w:rPr>
-      </w:pPr>
-      <w:r>
-        <w:rPr>
-          <w:rFonts w:hint="eastAsia" w:ascii="汉仪中宋简" w:hAnsi="汉仪中宋简" w:eastAsia="汉仪中宋简" w:cs="汉仪中宋简"/>
-          <w:snapToGrid/>
-          <w:kern w:val="2"/>
-          <w:sz w:val="24"/>
-          <w:szCs w:val="24"/>
-          <w:lang w:val="en-US" w:eastAsia="zh-CN"/>
-        </w:rPr>
-        <w:t xml:space="preserve">B. </w:t>
-      </w:r>
-      <w:r>
-        <w:rPr>
-          <w:rFonts w:hint="default" w:ascii="汉仪中宋简" w:hAnsi="汉仪中宋简" w:eastAsia="汉仪中宋简" w:cs="汉仪中宋简"/>
-          <w:snapToGrid/>
-          <w:kern w:val="2"/>
-          <w:sz w:val="24"/>
-          <w:szCs w:val="24"/>
-          <w:lang w:val="en-US" w:eastAsia="zh-CN"/>
-        </w:rPr>
-        <w:t>容易理解</w:t>
-      </w:r>
-    </w:p>
-    <w:p ns2:paraId="7D0C4622">
-      <w:pPr>
-        <w:keepNext w:val="0"/>
-        <w:keepLines w:val="0"/>
-        <w:pageBreakBefore w:val="0"/>
-        <w:widowControl w:val="0"/>
-        <w:numPr>
-          <w:ilvl w:val="0"/>
-          <w:numId w:val="0"/>
-        </w:numPr>
-        <w:kinsoku/>
-        <w:wordWrap/>
-        <w:overflowPunct/>
-        <w:topLinePunct w:val="0"/>
-        <w:autoSpaceDE/>
-        <w:autoSpaceDN/>
-        <w:bidi w:val="0"/>
-        <w:adjustRightInd/>
-        <w:snapToGrid/>
-        <w:spacing w:line="480" w:lineRule="auto"/>
-        <w:ind w:left="0" w:leftChars="0" w:firstLine="218" w:firstLineChars="91"/>
-        <w:jc w:val="left"/>
-        <w:textAlignment w:val="auto"/>
-        <w:rPr>
-          <w:rFonts w:hint="default" w:ascii="汉仪中宋简" w:hAnsi="汉仪中宋简" w:eastAsia="汉仪中宋简" w:cs="汉仪中宋简"/>
-          <w:snapToGrid/>
-          <w:kern w:val="2"/>
-          <w:sz w:val="24"/>
-          <w:szCs w:val="24"/>
-          <w:lang w:val="en-US" w:eastAsia="zh-CN"/>
-        </w:rPr>
-      </w:pPr>
-      <w:r>
-        <w:rPr>
-          <w:rFonts w:hint="eastAsia" w:ascii="汉仪中宋简" w:hAnsi="汉仪中宋简" w:eastAsia="汉仪中宋简" w:cs="汉仪中宋简"/>
-          <w:snapToGrid/>
-          <w:kern w:val="2"/>
-          <w:sz w:val="24"/>
-          <w:szCs w:val="24"/>
-          <w:lang w:val="en-US" w:eastAsia="zh-CN"/>
-        </w:rPr>
-        <w:t xml:space="preserve">C. </w:t>
-      </w:r>
-      <w:r>
-        <w:rPr>
-          <w:rFonts w:hint="default" w:ascii="汉仪中宋简" w:hAnsi="汉仪中宋简" w:eastAsia="汉仪中宋简" w:cs="汉仪中宋简"/>
-          <w:snapToGrid/>
-          <w:kern w:val="2"/>
-          <w:sz w:val="24"/>
-          <w:szCs w:val="24"/>
-          <w:lang w:val="en-US" w:eastAsia="zh-CN"/>
-        </w:rPr>
-        <w:t>部分内容不够明确</w:t>
-      </w:r>
-    </w:p>
-    <w:p ns2:paraId="185B13AD">
-      <w:pPr>
-        <w:keepNext w:val="0"/>
-        <w:keepLines w:val="0"/>
-        <w:pageBreakBefore w:val="0"/>
-        <w:widowControl w:val="0"/>
-        <w:numPr>
-          <w:ilvl w:val="0"/>
-          <w:numId w:val="0"/>
-        </w:numPr>
-        <w:kinsoku/>
-        <w:wordWrap/>
-        <w:overflowPunct/>
-        <w:topLinePunct w:val="0"/>
-        <w:autoSpaceDE/>
-        <w:autoSpaceDN/>
-        <w:bidi w:val="0"/>
-        <w:adjustRightInd/>
-        <w:snapToGrid/>
-        <w:spacing w:line="480" w:lineRule="auto"/>
-        <w:ind w:left="0" w:leftChars="0" w:firstLine="218" w:firstLineChars="91"/>
-        <w:jc w:val="left"/>
-        <w:textAlignment w:val="auto"/>
-        <w:rPr>
-          <w:rFonts w:hint="eastAsia" w:ascii="汉仪中宋简" w:hAnsi="汉仪中宋简" w:eastAsia="汉仪中宋简" w:cs="汉仪中宋简"/>
-          <w:snapToGrid/>
-          <w:kern w:val="2"/>
-          <w:sz w:val="24"/>
-          <w:szCs w:val="24"/>
-          <w:lang w:val="en-US" w:eastAsia="zh-CN"/>
-        </w:rPr>
-      </w:pPr>
-      <w:r>
-        <w:rPr>
-          <w:rFonts w:hint="eastAsia" w:ascii="汉仪中宋简" w:hAnsi="汉仪中宋简" w:eastAsia="汉仪中宋简" w:cs="汉仪中宋简"/>
-          <w:snapToGrid/>
-          <w:kern w:val="2"/>
-          <w:sz w:val="24"/>
-          <w:szCs w:val="24"/>
-          <w:lang w:val="en-US" w:eastAsia="zh-CN"/>
-        </w:rPr>
-        <w:t xml:space="preserve">D. </w:t>
-      </w:r>
-      <w:r>
-        <w:rPr>
-          <w:rFonts w:hint="default" w:ascii="汉仪中宋简" w:hAnsi="汉仪中宋简" w:eastAsia="汉仪中宋简" w:cs="汉仪中宋简"/>
-          <w:snapToGrid/>
-          <w:kern w:val="2"/>
-          <w:sz w:val="24"/>
-          <w:szCs w:val="24"/>
-          <w:lang w:val="en-US" w:eastAsia="zh-CN"/>
-        </w:rPr>
-        <w:t>难以分辨</w:t>
-      </w:r>
-    </w:p>
-    <w:p ns2:paraId="00B8B3B2">
-      <w:pPr>
-        <w:keepNext w:val="0"/>
-        <w:keepLines w:val="0"/>
-        <w:pageBreakBefore w:val="0"/>
-        <w:widowControl w:val="0"/>
-        <w:numPr>
-          <w:ilvl w:val="0"/>
-          <w:numId w:val="9"/>
-        </w:numPr>
-        <w:kinsoku/>
-        <w:wordWrap/>
-        <w:overflowPunct/>
-        <w:topLinePunct w:val="0"/>
-        <w:autoSpaceDE/>
-        <w:autoSpaceDN/>
-        <w:bidi w:val="0"/>
-        <w:adjustRightInd/>
-        <w:snapToGrid/>
-        <w:spacing w:line="480" w:lineRule="auto"/>
-        <w:ind w:left="425" w:leftChars="0" w:hanging="425" w:firstLineChars="0"/>
-        <w:jc w:val="left"/>
-        <w:textAlignment w:val="auto"/>
-        <w:rPr>
-          <w:rFonts w:hint="default" w:ascii="汉仪中宋简" w:hAnsi="汉仪中宋简" w:eastAsia="汉仪中宋简" w:cs="汉仪中宋简"/>
-          <w:snapToGrid/>
-          <w:kern w:val="2"/>
-          <w:sz w:val="24"/>
-          <w:szCs w:val="24"/>
-          <w:lang w:val="en-US" w:eastAsia="zh-CN"/>
-        </w:rPr>
-      </w:pPr>
-      <w:r>
-        <w:rPr>
-          <w:rFonts w:hint="default" w:ascii="汉仪中宋简" w:hAnsi="汉仪中宋简" w:eastAsia="汉仪中宋简" w:cs="汉仪中宋简"/>
-          <w:snapToGrid/>
-          <w:kern w:val="2"/>
-          <w:sz w:val="24"/>
-          <w:szCs w:val="24"/>
-          <w:lang w:val="en-US" w:eastAsia="zh-CN"/>
-        </w:rPr>
-        <w:t>您认为当前获取的用药指导是否足够详细准确？</w:t>
-      </w:r>
-    </w:p>
-    <w:p ns2:paraId="13782D53">
-      <w:pPr>
-        <w:keepNext w:val="0"/>
-        <w:keepLines w:val="0"/>
-        <w:pageBreakBefore w:val="0"/>
-        <w:widowControl w:val="0"/>
-        <w:numPr>
-          <w:ilvl w:val="0"/>
-          <w:numId w:val="0"/>
-        </w:numPr>
-        <w:kinsoku/>
-        <w:wordWrap/>
-        <w:overflowPunct/>
-        <w:topLinePunct w:val="0"/>
-        <w:autoSpaceDE/>
-        <w:autoSpaceDN/>
-        <w:bidi w:val="0"/>
-        <w:adjustRightInd/>
-        <w:snapToGrid/>
-        <w:spacing w:line="480" w:lineRule="auto"/>
-        <w:ind w:left="0" w:leftChars="0" w:firstLine="218" w:firstLineChars="91"/>
-        <w:jc w:val="left"/>
-        <w:textAlignment w:val="auto"/>
-        <w:rPr>
-          <w:rFonts w:hint="default" w:ascii="汉仪中宋简" w:hAnsi="汉仪中宋简" w:eastAsia="汉仪中宋简" w:cs="汉仪中宋简"/>
-          <w:snapToGrid/>
-          <w:kern w:val="2"/>
-          <w:sz w:val="24"/>
-          <w:szCs w:val="24"/>
-          <w:lang w:val="en-US" w:eastAsia="zh-CN"/>
-        </w:rPr>
-      </w:pPr>
-      <w:r>
-        <w:rPr>
-          <w:rFonts w:hint="eastAsia" w:ascii="汉仪中宋简" w:hAnsi="汉仪中宋简" w:eastAsia="汉仪中宋简" w:cs="汉仪中宋简"/>
-          <w:snapToGrid/>
-          <w:kern w:val="2"/>
-          <w:sz w:val="24"/>
-          <w:szCs w:val="24"/>
-          <w:lang w:val="en-US" w:eastAsia="zh-CN"/>
-        </w:rPr>
-        <w:t xml:space="preserve">A. </w:t>
-      </w:r>
-      <w:r>
-        <w:rPr>
-          <w:rFonts w:hint="default" w:ascii="汉仪中宋简" w:hAnsi="汉仪中宋简" w:eastAsia="汉仪中宋简" w:cs="汉仪中宋简"/>
-          <w:snapToGrid/>
-          <w:kern w:val="2"/>
-          <w:sz w:val="24"/>
-          <w:szCs w:val="24"/>
-          <w:lang w:val="en-US" w:eastAsia="zh-CN"/>
-        </w:rPr>
-        <w:t>非常详细准确，能解决所有疑问</w:t>
-      </w:r>
-    </w:p>
-    <w:p ns2:paraId="2536600B">
-      <w:pPr>
-        <w:keepNext w:val="0"/>
-        <w:keepLines w:val="0"/>
-        <w:pageBreakBefore w:val="0"/>
-        <w:widowControl w:val="0"/>
-        <w:numPr>
-          <w:ilvl w:val="0"/>
-          <w:numId w:val="0"/>
-        </w:numPr>
-        <w:kinsoku/>
-        <w:wordWrap/>
-        <w:overflowPunct/>
-        <w:topLinePunct w:val="0"/>
-        <w:autoSpaceDE/>
-        <w:autoSpaceDN/>
-        <w:bidi w:val="0"/>
-        <w:adjustRightInd/>
-        <w:snapToGrid/>
-        <w:spacing w:line="480" w:lineRule="auto"/>
-        <w:ind w:left="0" w:leftChars="0" w:firstLine="218" w:firstLineChars="91"/>
-        <w:jc w:val="left"/>
-        <w:textAlignment w:val="auto"/>
-        <w:rPr>
-          <w:rFonts w:hint="default" w:ascii="汉仪中宋简" w:hAnsi="汉仪中宋简" w:eastAsia="汉仪中宋简" w:cs="汉仪中宋简"/>
-          <w:snapToGrid/>
-          <w:kern w:val="2"/>
-          <w:sz w:val="24"/>
-          <w:szCs w:val="24"/>
-          <w:lang w:val="en-US" w:eastAsia="zh-CN"/>
-        </w:rPr>
-      </w:pPr>
-      <w:r>
-        <w:rPr>
-          <w:rFonts w:hint="eastAsia" w:ascii="汉仪中宋简" w:hAnsi="汉仪中宋简" w:eastAsia="汉仪中宋简" w:cs="汉仪中宋简"/>
-          <w:snapToGrid/>
-          <w:kern w:val="2"/>
-          <w:sz w:val="24"/>
-          <w:szCs w:val="24"/>
-          <w:lang w:val="en-US" w:eastAsia="zh-CN"/>
-        </w:rPr>
-        <w:t xml:space="preserve">B. </w:t>
-      </w:r>
-      <w:r>
-        <w:rPr>
-          <w:rFonts w:hint="default" w:ascii="汉仪中宋简" w:hAnsi="汉仪中宋简" w:eastAsia="汉仪中宋简" w:cs="汉仪中宋简"/>
-          <w:snapToGrid/>
-          <w:kern w:val="2"/>
-          <w:sz w:val="24"/>
-          <w:szCs w:val="24"/>
-          <w:lang w:val="en-US" w:eastAsia="zh-CN"/>
-        </w:rPr>
-        <w:t>比较详细准确，能解决大部分疑问</w:t>
-      </w:r>
-    </w:p>
-    <w:p ns2:paraId="5031355C">
-      <w:pPr>
-        <w:keepNext w:val="0"/>
-        <w:keepLines w:val="0"/>
-        <w:pageBreakBefore w:val="0"/>
-        <w:widowControl w:val="0"/>
-        <w:numPr>
-          <w:ilvl w:val="0"/>
-          <w:numId w:val="0"/>
-        </w:numPr>
-        <w:kinsoku/>
-        <w:wordWrap/>
-        <w:overflowPunct/>
-        <w:topLinePunct w:val="0"/>
-        <w:autoSpaceDE/>
-        <w:autoSpaceDN/>
-        <w:bidi w:val="0"/>
-        <w:adjustRightInd/>
-        <w:snapToGrid/>
-        <w:spacing w:line="480" w:lineRule="auto"/>
-        <w:ind w:left="0" w:leftChars="0" w:firstLine="218" w:firstLineChars="91"/>
-        <w:jc w:val="left"/>
-        <w:textAlignment w:val="auto"/>
-        <w:rPr>
-          <w:rFonts w:hint="default" w:ascii="汉仪中宋简" w:hAnsi="汉仪中宋简" w:eastAsia="汉仪中宋简" w:cs="汉仪中宋简"/>
-          <w:snapToGrid/>
-          <w:kern w:val="2"/>
-          <w:sz w:val="24"/>
-          <w:szCs w:val="24"/>
-          <w:lang w:val="en-US" w:eastAsia="zh-CN"/>
-        </w:rPr>
-      </w:pPr>
-      <w:r>
-        <w:rPr>
-          <w:rFonts w:hint="eastAsia" w:ascii="汉仪中宋简" w:hAnsi="汉仪中宋简" w:eastAsia="汉仪中宋简" w:cs="汉仪中宋简"/>
-          <w:snapToGrid/>
-          <w:kern w:val="2"/>
-          <w:sz w:val="24"/>
-          <w:szCs w:val="24"/>
-          <w:lang w:val="en-US" w:eastAsia="zh-CN"/>
-        </w:rPr>
-        <w:t xml:space="preserve">C. </w:t>
-      </w:r>
-      <w:r>
-        <w:rPr>
-          <w:rFonts w:hint="default" w:ascii="汉仪中宋简" w:hAnsi="汉仪中宋简" w:eastAsia="汉仪中宋简" w:cs="汉仪中宋简"/>
-          <w:snapToGrid/>
-          <w:kern w:val="2"/>
-          <w:sz w:val="24"/>
-          <w:szCs w:val="24"/>
-          <w:lang w:val="en-US" w:eastAsia="zh-CN"/>
-        </w:rPr>
-        <w:t>一般，部分疑问无法解答</w:t>
-      </w:r>
-    </w:p>
-    <w:p ns2:paraId="6743342D">
-      <w:pPr>
-        <w:keepNext w:val="0"/>
-        <w:keepLines w:val="0"/>
-        <w:pageBreakBefore w:val="0"/>
-        <w:widowControl w:val="0"/>
-        <w:numPr>
-          <w:ilvl w:val="0"/>
-          <w:numId w:val="0"/>
-        </w:numPr>
-        <w:kinsoku/>
-        <w:wordWrap/>
-        <w:overflowPunct/>
-        <w:topLinePunct w:val="0"/>
-        <w:autoSpaceDE/>
-        <w:autoSpaceDN/>
-        <w:bidi w:val="0"/>
-        <w:adjustRightInd/>
-        <w:snapToGrid/>
-        <w:spacing w:line="480" w:lineRule="auto"/>
-        <w:ind w:left="0" w:leftChars="0" w:firstLine="218" w:firstLineChars="91"/>
-        <w:jc w:val="left"/>
-        <w:textAlignment w:val="auto"/>
-        <w:rPr>
-          <w:rFonts w:hint="default" w:ascii="汉仪中宋简" w:hAnsi="汉仪中宋简" w:eastAsia="汉仪中宋简" w:cs="汉仪中宋简"/>
-          <w:snapToGrid/>
-          <w:kern w:val="2"/>
-          <w:sz w:val="24"/>
-          <w:szCs w:val="24"/>
-          <w:lang w:val="en-US" w:eastAsia="zh-CN"/>
-        </w:rPr>
-      </w:pPr>
-      <w:r>
-        <w:rPr>
-          <w:rFonts w:hint="eastAsia" w:ascii="汉仪中宋简" w:hAnsi="汉仪中宋简" w:eastAsia="汉仪中宋简" w:cs="汉仪中宋简"/>
-          <w:snapToGrid/>
-          <w:kern w:val="2"/>
-          <w:sz w:val="24"/>
-          <w:szCs w:val="24"/>
-          <w:lang w:val="en-US" w:eastAsia="zh-CN"/>
-        </w:rPr>
-        <w:t xml:space="preserve">D. </w:t>
-      </w:r>
-      <w:r>
-        <w:rPr>
-          <w:rFonts w:hint="default" w:ascii="汉仪中宋简" w:hAnsi="汉仪中宋简" w:eastAsia="汉仪中宋简" w:cs="汉仪中宋简"/>
-          <w:snapToGrid/>
-          <w:kern w:val="2"/>
-          <w:sz w:val="24"/>
-          <w:szCs w:val="24"/>
-          <w:lang w:val="en-US" w:eastAsia="zh-CN"/>
-        </w:rPr>
-        <w:t>不够详细准确，存在很多困惑</w:t>
-      </w:r>
+      <w:bookmarkEnd w:id="501"/>
     </w:p>
     <w:p ns2:paraId="2E498182">
       <w:pPr>

</xml_diff>

<commit_message>
Task 8: 迁移第 4 章 result_sections 动态块
</commit_message>
<xml_diff>
--- a/templates/efficacy-report-template.docx
+++ b/templates/efficacy-report-template.docx
@@ -4710,6 +4710,36 @@
           <w:lang w:val="en-US" w:eastAsia="zh-CN"/>
         </w:rPr>
       </w:pPr>
+      <w:bookmarkStart w:id="502" w:name="tpl_result_sections"/>
+      <w:bookmarkStart w:id="15" w:name="_Toc23502"/>
+      <w:r>
+        <w:rPr>
+          <w:rFonts w:hint="eastAsia" w:ascii="汉仪中宋简" w:hAnsi="汉仪中宋简" w:eastAsia="汉仪中宋简" w:cs="汉仪中宋简"/>
+          <w:lang w:val="en-US" w:eastAsia="zh-CN"/>
+        </w:rPr>
+        <w:t xml:space="preserve">{{repeat.result_sections}}</w:t>
+      </w:r>
+      <w:bookmarkEnd w:id="15"/>
+    </w:p>
+    <w:p ns2:paraId="062BDC27">
+      <w:pPr>
+        <w:pStyle w:val="3"/>
+        <w:pageBreakBefore w:val="0"/>
+        <w:kinsoku/>
+        <w:wordWrap/>
+        <w:overflowPunct/>
+        <w:topLinePunct w:val="0"/>
+        <w:autoSpaceDE/>
+        <w:autoSpaceDN/>
+        <w:bidi w:val="0"/>
+        <w:adjustRightInd/>
+        <w:snapToGrid/>
+        <w:spacing w:line="480" w:lineRule="auto"/>
+        <w:rPr>
+          <w:rFonts w:hint="eastAsia" w:ascii="汉仪中宋简" w:hAnsi="汉仪中宋简" w:eastAsia="汉仪中宋简" w:cs="汉仪中宋简"/>
+          <w:lang w:val="en-US" w:eastAsia="zh-CN"/>
+        </w:rPr>
+      </w:pPr>
       <w:bookmarkStart w:id="15" w:name="_Toc23502"/>
       <w:r>
         <w:rPr>
@@ -19331,6 +19361,7 @@
         </w:rPr>
         <w:t>专业的用药指导是保障患者安全用药的重要支撑，其详细准确性直接影响用药效果与安全性。调研显示，49.76%的患者认为当前获取的用药指导非常详细准确，能够解决所有用药疑问，说明医疗机构、药店等渠道提供的用药指导服务专业且全面，涵盖了服药时间、注意事项、不良反应应对措施等关键内容；44.15%的患者认为指导比较详细准确，能够解决大部分疑问，说明指导服务基本满足核心用药需求，仅存在少量细节问题未完全覆盖。两者合计占比93.91%，仅6.09%的患者认为部分疑问无法解答，整体反映出当前用药指导服务体系较为完善，能够为患者安全用药提供有效支撑。</w:t>
       </w:r>
+      <w:bookmarkEnd w:id="502"/>
     </w:p>
     <w:p ns2:paraId="4E07A1E7">
       <w:pPr>

</xml_diff>